<commit_message>
chore: continuar con integración de capturas de pantalla
</commit_message>
<xml_diff>
--- a/Docu_TFG/16.04Plantilla memoria escrita_FEEDBACK.docx
+++ b/Docu_TFG/16.04Plantilla memoria escrita_FEEDBACK.docx
@@ -227,7 +227,7 @@
                     <pic:cNvPicPr preferRelativeResize="0"/>
                   </pic:nvPicPr>
                   <pic:blipFill>
-                    <a:blip r:embed="rId8"/>
+                    <a:blip r:embed="rId9"/>
                     <a:srcRect/>
                     <a:stretch>
                       <a:fillRect/>
@@ -7021,1287 +7021,86 @@
     <w:p>
       <w:pPr>
         <w:spacing w:before="0" w:after="0"/>
-      </w:pPr>
-      <w:r>
-        <w:t xml:space="preserve">VecindApp </w:t>
-      </w:r>
+        <w:rPr>
+          <w:lang w:val="en-GB"/>
+        </w:rPr>
+      </w:pPr>
       <w:proofErr w:type="spellStart"/>
       <w:r>
-        <w:t>is</w:t>
+        <w:rPr>
+          <w:lang w:val="en-GB"/>
+        </w:rPr>
+        <w:t>VecindApp</w:t>
       </w:r>
       <w:proofErr w:type="spellEnd"/>
       <w:r>
-        <w:t xml:space="preserve"> a native Android </w:t>
-      </w:r>
-      <w:proofErr w:type="spellStart"/>
-      <w:r>
-        <w:t>application</w:t>
-      </w:r>
-      <w:proofErr w:type="spellEnd"/>
-      <w:r>
-        <w:t xml:space="preserve"> </w:t>
-      </w:r>
-      <w:proofErr w:type="spellStart"/>
-      <w:r>
-        <w:t>designed</w:t>
-      </w:r>
-      <w:proofErr w:type="spellEnd"/>
-      <w:r>
-        <w:t xml:space="preserve"> as a </w:t>
-      </w:r>
-      <w:proofErr w:type="spellStart"/>
-      <w:r>
-        <w:t>hyperlocal</w:t>
-      </w:r>
-      <w:proofErr w:type="spellEnd"/>
-      <w:r>
-        <w:t xml:space="preserve"> time </w:t>
-      </w:r>
-      <w:proofErr w:type="spellStart"/>
-      <w:r>
-        <w:t>bank</w:t>
-      </w:r>
-      <w:proofErr w:type="spellEnd"/>
-      <w:r>
-        <w:t xml:space="preserve"> </w:t>
-      </w:r>
-      <w:proofErr w:type="spellStart"/>
-      <w:r>
-        <w:t>where</w:t>
-      </w:r>
-      <w:proofErr w:type="spellEnd"/>
-      <w:r>
-        <w:t xml:space="preserve"> </w:t>
-      </w:r>
-      <w:proofErr w:type="spellStart"/>
-      <w:r>
-        <w:t>neighbours</w:t>
-      </w:r>
-      <w:proofErr w:type="spellEnd"/>
-      <w:r>
-        <w:t xml:space="preserve"> </w:t>
-      </w:r>
-      <w:proofErr w:type="spellStart"/>
-      <w:r>
-        <w:t>exchange</w:t>
-      </w:r>
-      <w:proofErr w:type="spellEnd"/>
-      <w:r>
-        <w:t xml:space="preserve"> </w:t>
-      </w:r>
-      <w:proofErr w:type="spellStart"/>
-      <w:r>
-        <w:t>services</w:t>
-      </w:r>
-      <w:proofErr w:type="spellEnd"/>
-      <w:r>
-        <w:t xml:space="preserve"> </w:t>
-      </w:r>
-      <w:proofErr w:type="spellStart"/>
-      <w:r>
-        <w:t>using</w:t>
-      </w:r>
-      <w:proofErr w:type="spellEnd"/>
-      <w:r>
-        <w:t xml:space="preserve"> </w:t>
-      </w:r>
-      <w:proofErr w:type="spellStart"/>
-      <w:r>
-        <w:t>hours</w:t>
-      </w:r>
-      <w:proofErr w:type="spellEnd"/>
-      <w:r>
-        <w:t xml:space="preserve"> as </w:t>
-      </w:r>
-      <w:proofErr w:type="spellStart"/>
-      <w:r>
-        <w:t>the</w:t>
-      </w:r>
-      <w:proofErr w:type="spellEnd"/>
-      <w:r>
-        <w:t xml:space="preserve"> sole </w:t>
-      </w:r>
-      <w:proofErr w:type="spellStart"/>
-      <w:r>
-        <w:t>unit</w:t>
-      </w:r>
-      <w:proofErr w:type="spellEnd"/>
-      <w:r>
-        <w:t xml:space="preserve"> </w:t>
-      </w:r>
-      <w:proofErr w:type="spellStart"/>
-      <w:r>
-        <w:t>of</w:t>
-      </w:r>
-      <w:proofErr w:type="spellEnd"/>
-      <w:r>
-        <w:t xml:space="preserve"> </w:t>
-      </w:r>
-      <w:proofErr w:type="spellStart"/>
-      <w:r>
-        <w:t>value</w:t>
-      </w:r>
-      <w:proofErr w:type="spellEnd"/>
-      <w:r>
-        <w:t xml:space="preserve"> </w:t>
-      </w:r>
-      <w:proofErr w:type="spellStart"/>
-      <w:r>
-        <w:t>instead</w:t>
-      </w:r>
-      <w:proofErr w:type="spellEnd"/>
-      <w:r>
-        <w:t xml:space="preserve"> </w:t>
-      </w:r>
-      <w:proofErr w:type="spellStart"/>
-      <w:r>
-        <w:t>of</w:t>
-      </w:r>
-      <w:proofErr w:type="spellEnd"/>
-      <w:r>
-        <w:t xml:space="preserve"> </w:t>
-      </w:r>
-      <w:proofErr w:type="spellStart"/>
-      <w:r>
-        <w:t>money</w:t>
-      </w:r>
-      <w:proofErr w:type="spellEnd"/>
-      <w:r>
-        <w:t xml:space="preserve">. </w:t>
-      </w:r>
-      <w:proofErr w:type="spellStart"/>
-      <w:r>
-        <w:t>Users</w:t>
-      </w:r>
-      <w:proofErr w:type="spellEnd"/>
-      <w:r>
-        <w:t xml:space="preserve"> can </w:t>
-      </w:r>
-      <w:proofErr w:type="spellStart"/>
-      <w:r>
-        <w:t>register</w:t>
-      </w:r>
-      <w:proofErr w:type="spellEnd"/>
-      <w:r>
-        <w:t xml:space="preserve"> </w:t>
-      </w:r>
-      <w:proofErr w:type="spellStart"/>
-      <w:r>
-        <w:t>with</w:t>
-      </w:r>
-      <w:proofErr w:type="spellEnd"/>
-      <w:r>
-        <w:t xml:space="preserve"> a </w:t>
-      </w:r>
-      <w:proofErr w:type="spellStart"/>
-      <w:r>
-        <w:t>unique</w:t>
-      </w:r>
-      <w:proofErr w:type="spellEnd"/>
-      <w:r>
-        <w:t xml:space="preserve"> </w:t>
-      </w:r>
-      <w:proofErr w:type="spellStart"/>
-      <w:r>
-        <w:t>profile</w:t>
-      </w:r>
-      <w:proofErr w:type="spellEnd"/>
-      <w:r>
-        <w:t xml:space="preserve">, </w:t>
-      </w:r>
-      <w:proofErr w:type="spellStart"/>
-      <w:r>
-        <w:t>publish</w:t>
-      </w:r>
-      <w:proofErr w:type="spellEnd"/>
-      <w:r>
-        <w:t xml:space="preserve"> </w:t>
-      </w:r>
-      <w:proofErr w:type="spellStart"/>
-      <w:r>
-        <w:t>service</w:t>
-      </w:r>
-      <w:proofErr w:type="spellEnd"/>
-      <w:r>
-        <w:t xml:space="preserve"> </w:t>
-      </w:r>
-      <w:proofErr w:type="spellStart"/>
-      <w:r>
-        <w:t>offers</w:t>
-      </w:r>
-      <w:proofErr w:type="spellEnd"/>
-      <w:r>
-        <w:t xml:space="preserve"> </w:t>
-      </w:r>
-      <w:proofErr w:type="spellStart"/>
-      <w:r>
-        <w:t>categorised</w:t>
-      </w:r>
-      <w:proofErr w:type="spellEnd"/>
-      <w:r>
-        <w:t xml:space="preserve"> </w:t>
-      </w:r>
-      <w:proofErr w:type="spellStart"/>
-      <w:r>
-        <w:t>by</w:t>
-      </w:r>
-      <w:proofErr w:type="spellEnd"/>
-      <w:r>
-        <w:t xml:space="preserve"> </w:t>
-      </w:r>
-      <w:proofErr w:type="spellStart"/>
-      <w:r>
-        <w:t>type</w:t>
-      </w:r>
-      <w:proofErr w:type="spellEnd"/>
-      <w:r>
-        <w:t xml:space="preserve"> (home </w:t>
-      </w:r>
-      <w:proofErr w:type="spellStart"/>
-      <w:r>
-        <w:t>repairs</w:t>
-      </w:r>
-      <w:proofErr w:type="spellEnd"/>
-      <w:r>
-        <w:t xml:space="preserve">, </w:t>
-      </w:r>
-      <w:proofErr w:type="spellStart"/>
-      <w:r>
-        <w:t>elderly</w:t>
-      </w:r>
-      <w:proofErr w:type="spellEnd"/>
-      <w:r>
-        <w:t xml:space="preserve"> </w:t>
-      </w:r>
-      <w:proofErr w:type="spellStart"/>
-      <w:r>
-        <w:t>companionship</w:t>
-      </w:r>
-      <w:proofErr w:type="spellEnd"/>
-      <w:r>
-        <w:t xml:space="preserve">, administrative </w:t>
-      </w:r>
-      <w:proofErr w:type="spellStart"/>
-      <w:r>
-        <w:t>assistance</w:t>
-      </w:r>
-      <w:proofErr w:type="spellEnd"/>
-      <w:r>
-        <w:t xml:space="preserve">, </w:t>
-      </w:r>
-      <w:proofErr w:type="spellStart"/>
-      <w:r>
-        <w:t>among</w:t>
-      </w:r>
-      <w:proofErr w:type="spellEnd"/>
-      <w:r>
-        <w:t xml:space="preserve"> </w:t>
-      </w:r>
-      <w:proofErr w:type="spellStart"/>
-      <w:r>
-        <w:t>others</w:t>
-      </w:r>
-      <w:proofErr w:type="spellEnd"/>
-      <w:r>
-        <w:t xml:space="preserve">), </w:t>
-      </w:r>
-      <w:proofErr w:type="spellStart"/>
-      <w:r>
-        <w:t>browse</w:t>
-      </w:r>
-      <w:proofErr w:type="spellEnd"/>
-      <w:r>
-        <w:t xml:space="preserve"> a </w:t>
-      </w:r>
-      <w:proofErr w:type="spellStart"/>
-      <w:r>
-        <w:t>neighbourhood</w:t>
-      </w:r>
-      <w:proofErr w:type="spellEnd"/>
-      <w:r>
-        <w:t xml:space="preserve"> </w:t>
-      </w:r>
-      <w:proofErr w:type="spellStart"/>
-      <w:r>
+        <w:rPr>
+          <w:lang w:val="en-GB"/>
+        </w:rPr>
+        <w:t xml:space="preserve"> is a native Android application designed as a hyperlocal time bank where neighbours exchange services using hours as the sole unit of value instead of money. Users can register with a unique profile, publish service offers categorised by type (home repairs, elderly companionship, administrative assistance, among others), browse a neighbourhood </w:t>
+      </w:r>
+      <w:r>
+        <w:rPr>
+          <w:lang w:val="en-GB"/>
+        </w:rPr>
         <w:lastRenderedPageBreak/>
-        <w:t>showcase</w:t>
-      </w:r>
-      <w:proofErr w:type="spellEnd"/>
-      <w:r>
-        <w:t xml:space="preserve">, and </w:t>
-      </w:r>
-      <w:proofErr w:type="spellStart"/>
-      <w:r>
-        <w:t>request</w:t>
-      </w:r>
-      <w:proofErr w:type="spellEnd"/>
-      <w:r>
-        <w:t xml:space="preserve"> </w:t>
-      </w:r>
-      <w:proofErr w:type="spellStart"/>
-      <w:r>
-        <w:t>services</w:t>
-      </w:r>
-      <w:proofErr w:type="spellEnd"/>
-      <w:r>
-        <w:t xml:space="preserve"> </w:t>
-      </w:r>
-      <w:proofErr w:type="spellStart"/>
-      <w:r>
-        <w:t>from</w:t>
-      </w:r>
-      <w:proofErr w:type="spellEnd"/>
-      <w:r>
-        <w:t xml:space="preserve"> </w:t>
-      </w:r>
-      <w:proofErr w:type="spellStart"/>
-      <w:r>
-        <w:t>other</w:t>
-      </w:r>
-      <w:proofErr w:type="spellEnd"/>
-      <w:r>
-        <w:t xml:space="preserve"> </w:t>
-      </w:r>
-      <w:proofErr w:type="spellStart"/>
-      <w:r>
-        <w:t>residents</w:t>
-      </w:r>
-      <w:proofErr w:type="spellEnd"/>
-      <w:r>
-        <w:t xml:space="preserve">. The </w:t>
-      </w:r>
-      <w:proofErr w:type="spellStart"/>
-      <w:r>
-        <w:t>transaction</w:t>
-      </w:r>
-      <w:proofErr w:type="spellEnd"/>
-      <w:r>
-        <w:t xml:space="preserve"> </w:t>
-      </w:r>
-      <w:proofErr w:type="spellStart"/>
-      <w:r>
-        <w:t>system</w:t>
-      </w:r>
-      <w:proofErr w:type="spellEnd"/>
-      <w:r>
-        <w:t xml:space="preserve"> </w:t>
-      </w:r>
-      <w:proofErr w:type="spellStart"/>
-      <w:r>
-        <w:t>atomically</w:t>
-      </w:r>
-      <w:proofErr w:type="spellEnd"/>
-      <w:r>
-        <w:t xml:space="preserve"> </w:t>
-      </w:r>
-      <w:proofErr w:type="spellStart"/>
-      <w:r>
-        <w:t>validates</w:t>
-      </w:r>
-      <w:proofErr w:type="spellEnd"/>
-      <w:r>
-        <w:t xml:space="preserve"> </w:t>
-      </w:r>
-      <w:proofErr w:type="spellStart"/>
-      <w:r>
-        <w:t>the</w:t>
-      </w:r>
-      <w:proofErr w:type="spellEnd"/>
-      <w:r>
-        <w:t xml:space="preserve"> </w:t>
-      </w:r>
-      <w:proofErr w:type="spellStart"/>
-      <w:r>
-        <w:t>buyer's</w:t>
-      </w:r>
-      <w:proofErr w:type="spellEnd"/>
-      <w:r>
-        <w:t xml:space="preserve"> balance </w:t>
-      </w:r>
-      <w:proofErr w:type="spellStart"/>
-      <w:r>
-        <w:t>before</w:t>
-      </w:r>
-      <w:proofErr w:type="spellEnd"/>
-      <w:r>
-        <w:t xml:space="preserve"> </w:t>
-      </w:r>
-      <w:proofErr w:type="spellStart"/>
-      <w:r>
-        <w:t>transferring</w:t>
-      </w:r>
-      <w:proofErr w:type="spellEnd"/>
-      <w:r>
-        <w:t xml:space="preserve"> </w:t>
-      </w:r>
-      <w:proofErr w:type="spellStart"/>
-      <w:r>
-        <w:t>hours</w:t>
-      </w:r>
-      <w:proofErr w:type="spellEnd"/>
-      <w:r>
-        <w:t xml:space="preserve"> </w:t>
-      </w:r>
-      <w:proofErr w:type="spellStart"/>
-      <w:r>
-        <w:t>between</w:t>
-      </w:r>
-      <w:proofErr w:type="spellEnd"/>
-      <w:r>
-        <w:t xml:space="preserve"> </w:t>
-      </w:r>
-      <w:proofErr w:type="spellStart"/>
-      <w:r>
-        <w:t>users</w:t>
-      </w:r>
-      <w:proofErr w:type="spellEnd"/>
-      <w:r>
-        <w:t>.</w:t>
+        <w:t>showcase, and request services from other residents. The transaction system atomically validates the buyer's balance before transferring hours between users.</w:t>
       </w:r>
     </w:p>
     <w:p>
       <w:pPr>
         <w:spacing w:before="0" w:after="0"/>
-      </w:pPr>
-      <w:r>
-        <w:t xml:space="preserve">The </w:t>
-      </w:r>
-      <w:proofErr w:type="spellStart"/>
-      <w:r>
-        <w:t>project</w:t>
-      </w:r>
-      <w:proofErr w:type="spellEnd"/>
-      <w:r>
-        <w:t xml:space="preserve"> places universal </w:t>
-      </w:r>
-      <w:proofErr w:type="spellStart"/>
-      <w:r>
-        <w:t>accessibility</w:t>
-      </w:r>
-      <w:proofErr w:type="spellEnd"/>
-      <w:r>
-        <w:t xml:space="preserve"> at </w:t>
-      </w:r>
-      <w:proofErr w:type="spellStart"/>
-      <w:r>
-        <w:t>its</w:t>
-      </w:r>
-      <w:proofErr w:type="spellEnd"/>
-      <w:r>
-        <w:t xml:space="preserve"> </w:t>
-      </w:r>
-      <w:proofErr w:type="spellStart"/>
-      <w:r>
-        <w:t>core</w:t>
-      </w:r>
-      <w:proofErr w:type="spellEnd"/>
-      <w:r>
-        <w:t xml:space="preserve">. </w:t>
-      </w:r>
-      <w:proofErr w:type="spellStart"/>
-      <w:r>
-        <w:t>It</w:t>
-      </w:r>
-      <w:proofErr w:type="spellEnd"/>
-      <w:r>
-        <w:t xml:space="preserve"> </w:t>
-      </w:r>
-      <w:proofErr w:type="spellStart"/>
-      <w:r>
-        <w:t>integrates</w:t>
-      </w:r>
-      <w:proofErr w:type="spellEnd"/>
-      <w:r>
-        <w:t xml:space="preserve"> </w:t>
-      </w:r>
-      <w:proofErr w:type="spellStart"/>
-      <w:r>
-        <w:t>Android's</w:t>
-      </w:r>
-      <w:proofErr w:type="spellEnd"/>
-      <w:r>
-        <w:t xml:space="preserve"> native Text-</w:t>
-      </w:r>
-      <w:proofErr w:type="spellStart"/>
-      <w:r>
-        <w:t>to</w:t>
-      </w:r>
-      <w:proofErr w:type="spellEnd"/>
-      <w:r>
-        <w:t xml:space="preserve">-Speech (TTS) </w:t>
-      </w:r>
-      <w:proofErr w:type="spellStart"/>
-      <w:r>
-        <w:t>engine</w:t>
-      </w:r>
-      <w:proofErr w:type="spellEnd"/>
-      <w:r>
-        <w:t xml:space="preserve"> </w:t>
-      </w:r>
-      <w:proofErr w:type="spellStart"/>
-      <w:r>
-        <w:t>to</w:t>
-      </w:r>
-      <w:proofErr w:type="spellEnd"/>
-      <w:r>
-        <w:t xml:space="preserve"> </w:t>
-      </w:r>
-      <w:proofErr w:type="spellStart"/>
-      <w:r>
-        <w:t>read</w:t>
-      </w:r>
-      <w:proofErr w:type="spellEnd"/>
-      <w:r>
-        <w:t xml:space="preserve"> </w:t>
-      </w:r>
-      <w:proofErr w:type="spellStart"/>
-      <w:r>
-        <w:t>titles</w:t>
-      </w:r>
-      <w:proofErr w:type="spellEnd"/>
-      <w:r>
-        <w:t xml:space="preserve">, </w:t>
-      </w:r>
-      <w:proofErr w:type="spellStart"/>
-      <w:r>
-        <w:t>descriptions</w:t>
-      </w:r>
-      <w:proofErr w:type="spellEnd"/>
-      <w:r>
-        <w:t xml:space="preserve"> and </w:t>
-      </w:r>
-      <w:proofErr w:type="spellStart"/>
-      <w:r>
-        <w:t>reviews</w:t>
-      </w:r>
-      <w:proofErr w:type="spellEnd"/>
-      <w:r>
-        <w:t xml:space="preserve"> </w:t>
-      </w:r>
-      <w:proofErr w:type="spellStart"/>
-      <w:r>
-        <w:t>aloud</w:t>
-      </w:r>
-      <w:proofErr w:type="spellEnd"/>
-      <w:r>
-        <w:t xml:space="preserve">, </w:t>
-      </w:r>
-      <w:proofErr w:type="spellStart"/>
-      <w:r>
-        <w:t>assisting</w:t>
-      </w:r>
-      <w:proofErr w:type="spellEnd"/>
-      <w:r>
-        <w:t xml:space="preserve"> </w:t>
-      </w:r>
-      <w:proofErr w:type="spellStart"/>
-      <w:r>
-        <w:t>users</w:t>
-      </w:r>
-      <w:proofErr w:type="spellEnd"/>
-      <w:r>
-        <w:t xml:space="preserve"> </w:t>
-      </w:r>
-      <w:proofErr w:type="spellStart"/>
-      <w:r>
-        <w:t>with</w:t>
-      </w:r>
-      <w:proofErr w:type="spellEnd"/>
-      <w:r>
-        <w:t xml:space="preserve"> </w:t>
-      </w:r>
-      <w:proofErr w:type="spellStart"/>
-      <w:r>
-        <w:t>low</w:t>
-      </w:r>
-      <w:proofErr w:type="spellEnd"/>
-      <w:r>
-        <w:t xml:space="preserve"> </w:t>
-      </w:r>
-      <w:proofErr w:type="spellStart"/>
-      <w:r>
-        <w:t>vision</w:t>
-      </w:r>
-      <w:proofErr w:type="spellEnd"/>
-      <w:r>
-        <w:t xml:space="preserve">, </w:t>
-      </w:r>
-      <w:proofErr w:type="spellStart"/>
-      <w:r>
-        <w:t>reading</w:t>
-      </w:r>
-      <w:proofErr w:type="spellEnd"/>
-      <w:r>
-        <w:t xml:space="preserve"> </w:t>
-      </w:r>
-      <w:proofErr w:type="spellStart"/>
-      <w:r>
-        <w:t>difficulties</w:t>
-      </w:r>
-      <w:proofErr w:type="spellEnd"/>
-      <w:r>
-        <w:t xml:space="preserve"> </w:t>
-      </w:r>
-      <w:proofErr w:type="spellStart"/>
-      <w:r>
-        <w:t>or</w:t>
-      </w:r>
-      <w:proofErr w:type="spellEnd"/>
-      <w:r>
-        <w:t xml:space="preserve"> </w:t>
-      </w:r>
-      <w:proofErr w:type="spellStart"/>
-      <w:r>
-        <w:t>limited</w:t>
-      </w:r>
-      <w:proofErr w:type="spellEnd"/>
-      <w:r>
-        <w:t xml:space="preserve"> </w:t>
-      </w:r>
-      <w:proofErr w:type="spellStart"/>
-      <w:r>
-        <w:t>literacy</w:t>
-      </w:r>
-      <w:proofErr w:type="spellEnd"/>
-      <w:r>
-        <w:t xml:space="preserve">. Additionally, </w:t>
-      </w:r>
-      <w:proofErr w:type="spellStart"/>
-      <w:r>
-        <w:t>the</w:t>
-      </w:r>
-      <w:proofErr w:type="spellEnd"/>
-      <w:r>
-        <w:t xml:space="preserve"> </w:t>
-      </w:r>
-      <w:proofErr w:type="spellStart"/>
-      <w:r>
-        <w:t>traditional</w:t>
-      </w:r>
-      <w:proofErr w:type="spellEnd"/>
-      <w:r>
-        <w:t xml:space="preserve"> </w:t>
-      </w:r>
-      <w:proofErr w:type="spellStart"/>
-      <w:r>
-        <w:t>star-based</w:t>
-      </w:r>
-      <w:proofErr w:type="spellEnd"/>
-      <w:r>
-        <w:t xml:space="preserve"> rating </w:t>
-      </w:r>
-      <w:proofErr w:type="spellStart"/>
-      <w:r>
-        <w:t>system</w:t>
-      </w:r>
-      <w:proofErr w:type="spellEnd"/>
-      <w:r>
-        <w:t xml:space="preserve"> </w:t>
-      </w:r>
-      <w:proofErr w:type="spellStart"/>
-      <w:r>
-        <w:t>is</w:t>
-      </w:r>
-      <w:proofErr w:type="spellEnd"/>
-      <w:r>
-        <w:t xml:space="preserve"> </w:t>
-      </w:r>
-      <w:proofErr w:type="spellStart"/>
-      <w:r>
-        <w:t>replaced</w:t>
-      </w:r>
-      <w:proofErr w:type="spellEnd"/>
-      <w:r>
-        <w:t xml:space="preserve"> </w:t>
-      </w:r>
-      <w:proofErr w:type="spellStart"/>
-      <w:r>
-        <w:t>by</w:t>
-      </w:r>
-      <w:proofErr w:type="spellEnd"/>
-      <w:r>
-        <w:t xml:space="preserve"> ARASAAC </w:t>
-      </w:r>
-      <w:proofErr w:type="spellStart"/>
-      <w:r>
-        <w:t>pictograms</w:t>
-      </w:r>
-      <w:proofErr w:type="spellEnd"/>
-      <w:r>
-        <w:t xml:space="preserve">, a </w:t>
-      </w:r>
-      <w:proofErr w:type="spellStart"/>
-      <w:r>
-        <w:t>nationally</w:t>
-      </w:r>
-      <w:proofErr w:type="spellEnd"/>
-      <w:r>
-        <w:t xml:space="preserve"> </w:t>
-      </w:r>
-      <w:proofErr w:type="spellStart"/>
-      <w:r>
-        <w:t>recognised</w:t>
-      </w:r>
-      <w:proofErr w:type="spellEnd"/>
-      <w:r>
-        <w:t xml:space="preserve"> standard </w:t>
-      </w:r>
-      <w:proofErr w:type="spellStart"/>
-      <w:r>
-        <w:t>for</w:t>
-      </w:r>
-      <w:proofErr w:type="spellEnd"/>
-      <w:r>
-        <w:t xml:space="preserve"> cognitive </w:t>
-      </w:r>
-      <w:proofErr w:type="spellStart"/>
-      <w:r>
-        <w:t>accessibility</w:t>
-      </w:r>
-      <w:proofErr w:type="spellEnd"/>
-      <w:r>
-        <w:t xml:space="preserve">, </w:t>
-      </w:r>
-      <w:proofErr w:type="spellStart"/>
-      <w:r>
-        <w:t>reducing</w:t>
-      </w:r>
-      <w:proofErr w:type="spellEnd"/>
-      <w:r>
-        <w:t xml:space="preserve"> cognitive </w:t>
-      </w:r>
-      <w:proofErr w:type="spellStart"/>
-      <w:r>
-        <w:t>barriers</w:t>
-      </w:r>
-      <w:proofErr w:type="spellEnd"/>
-      <w:r>
-        <w:t xml:space="preserve"> in </w:t>
-      </w:r>
-      <w:proofErr w:type="spellStart"/>
-      <w:r>
-        <w:t>the</w:t>
-      </w:r>
-      <w:proofErr w:type="spellEnd"/>
-      <w:r>
-        <w:t xml:space="preserve"> </w:t>
-      </w:r>
-      <w:proofErr w:type="spellStart"/>
-      <w:r>
-        <w:t>feedback</w:t>
-      </w:r>
-      <w:proofErr w:type="spellEnd"/>
-      <w:r>
-        <w:t xml:space="preserve"> </w:t>
-      </w:r>
-      <w:proofErr w:type="spellStart"/>
-      <w:r>
-        <w:t>process</w:t>
-      </w:r>
-      <w:proofErr w:type="spellEnd"/>
-      <w:r>
-        <w:t xml:space="preserve">. Service </w:t>
-      </w:r>
-      <w:proofErr w:type="spellStart"/>
-      <w:r>
-        <w:t>categories</w:t>
-      </w:r>
-      <w:proofErr w:type="spellEnd"/>
-      <w:r>
-        <w:t xml:space="preserve"> are </w:t>
-      </w:r>
-      <w:proofErr w:type="spellStart"/>
-      <w:r>
-        <w:t>also</w:t>
-      </w:r>
-      <w:proofErr w:type="spellEnd"/>
-      <w:r>
-        <w:t xml:space="preserve"> </w:t>
-      </w:r>
-      <w:proofErr w:type="spellStart"/>
-      <w:r>
-        <w:t>visually</w:t>
-      </w:r>
-      <w:proofErr w:type="spellEnd"/>
-      <w:r>
-        <w:t xml:space="preserve"> </w:t>
-      </w:r>
-      <w:proofErr w:type="spellStart"/>
-      <w:r>
-        <w:t>identified</w:t>
-      </w:r>
-      <w:proofErr w:type="spellEnd"/>
-      <w:r>
-        <w:t xml:space="preserve"> </w:t>
-      </w:r>
-      <w:proofErr w:type="spellStart"/>
-      <w:r>
-        <w:t>through</w:t>
-      </w:r>
-      <w:proofErr w:type="spellEnd"/>
-      <w:r>
-        <w:t xml:space="preserve"> </w:t>
-      </w:r>
-      <w:proofErr w:type="spellStart"/>
-      <w:r>
-        <w:t>dynamically</w:t>
-      </w:r>
-      <w:proofErr w:type="spellEnd"/>
-      <w:r>
-        <w:t xml:space="preserve"> </w:t>
-      </w:r>
-      <w:proofErr w:type="spellStart"/>
-      <w:r>
-        <w:t>assigned</w:t>
-      </w:r>
-      <w:proofErr w:type="spellEnd"/>
-      <w:r>
-        <w:t xml:space="preserve"> </w:t>
-      </w:r>
-      <w:proofErr w:type="spellStart"/>
-      <w:r>
-        <w:t>pictograms</w:t>
-      </w:r>
-      <w:proofErr w:type="spellEnd"/>
-      <w:r>
-        <w:t>.</w:t>
+        <w:rPr>
+          <w:lang w:val="en-GB"/>
+        </w:rPr>
+      </w:pPr>
+      <w:r>
+        <w:rPr>
+          <w:lang w:val="en-GB"/>
+        </w:rPr>
+        <w:t>The project places universal accessibility at its core. It integrates Android's native Text-to-Speech (TTS) engine to read titles, descriptions and reviews aloud, assisting users with low vision, reading difficulties or limited literacy. Additionally, the traditional star-based rating system is replaced by ARASAAC pictograms, a nationally recognised standard for cognitive accessibility, reducing cognitive barriers in the feedback process. Service categories are also visually identified through dynamically assigned pictograms.</w:t>
       </w:r>
     </w:p>
     <w:p>
       <w:pPr>
         <w:spacing w:before="0" w:after="0"/>
-      </w:pPr>
+        <w:rPr>
+          <w:lang w:val="en-GB"/>
+        </w:rPr>
+      </w:pPr>
+      <w:r>
+        <w:rPr>
+          <w:lang w:val="en-GB"/>
+        </w:rPr>
+        <w:t xml:space="preserve">On the technical side, </w:t>
+      </w:r>
       <w:proofErr w:type="spellStart"/>
       <w:r>
-        <w:t>On</w:t>
+        <w:rPr>
+          <w:lang w:val="en-GB"/>
+        </w:rPr>
+        <w:t>VecindApp</w:t>
       </w:r>
       <w:proofErr w:type="spellEnd"/>
       <w:r>
-        <w:t xml:space="preserve"> </w:t>
+        <w:rPr>
+          <w:lang w:val="en-GB"/>
+        </w:rPr>
+        <w:t xml:space="preserve"> is built entirely offline-first using Room/SQLite, follows the MVVM + Clean Architecture pattern recommended by Google, and leverages </w:t>
       </w:r>
       <w:proofErr w:type="spellStart"/>
       <w:r>
-        <w:t>the</w:t>
+        <w:rPr>
+          <w:lang w:val="en-GB"/>
+        </w:rPr>
+        <w:t>MPAndroidChart</w:t>
       </w:r>
       <w:proofErr w:type="spellEnd"/>
       <w:r>
-        <w:t xml:space="preserve"> </w:t>
-      </w:r>
-      <w:proofErr w:type="spellStart"/>
-      <w:r>
-        <w:t>technical</w:t>
-      </w:r>
-      <w:proofErr w:type="spellEnd"/>
-      <w:r>
-        <w:t xml:space="preserve"> </w:t>
-      </w:r>
-      <w:proofErr w:type="spellStart"/>
-      <w:r>
-        <w:t>side</w:t>
-      </w:r>
-      <w:proofErr w:type="spellEnd"/>
-      <w:r>
-        <w:t xml:space="preserve">, VecindApp </w:t>
-      </w:r>
-      <w:proofErr w:type="spellStart"/>
-      <w:r>
-        <w:t>is</w:t>
-      </w:r>
-      <w:proofErr w:type="spellEnd"/>
-      <w:r>
-        <w:t xml:space="preserve"> </w:t>
-      </w:r>
-      <w:proofErr w:type="spellStart"/>
-      <w:r>
-        <w:t>built</w:t>
-      </w:r>
-      <w:proofErr w:type="spellEnd"/>
-      <w:r>
-        <w:t xml:space="preserve"> </w:t>
-      </w:r>
-      <w:proofErr w:type="spellStart"/>
-      <w:r>
-        <w:t>entirely</w:t>
-      </w:r>
-      <w:proofErr w:type="spellEnd"/>
-      <w:r>
-        <w:t xml:space="preserve"> offline-</w:t>
-      </w:r>
-      <w:proofErr w:type="spellStart"/>
-      <w:r>
-        <w:t>first</w:t>
-      </w:r>
-      <w:proofErr w:type="spellEnd"/>
-      <w:r>
-        <w:t xml:space="preserve"> </w:t>
-      </w:r>
-      <w:proofErr w:type="spellStart"/>
-      <w:r>
-        <w:t>using</w:t>
-      </w:r>
-      <w:proofErr w:type="spellEnd"/>
-      <w:r>
-        <w:t xml:space="preserve"> Room/SQLite, </w:t>
-      </w:r>
-      <w:proofErr w:type="spellStart"/>
-      <w:r>
-        <w:t>follows</w:t>
-      </w:r>
-      <w:proofErr w:type="spellEnd"/>
-      <w:r>
-        <w:t xml:space="preserve"> </w:t>
-      </w:r>
-      <w:proofErr w:type="spellStart"/>
-      <w:r>
-        <w:t>the</w:t>
-      </w:r>
-      <w:proofErr w:type="spellEnd"/>
-      <w:r>
-        <w:t xml:space="preserve"> MVVM + </w:t>
-      </w:r>
-      <w:proofErr w:type="spellStart"/>
-      <w:r>
-        <w:t>Clean</w:t>
-      </w:r>
-      <w:proofErr w:type="spellEnd"/>
-      <w:r>
-        <w:t xml:space="preserve"> </w:t>
-      </w:r>
-      <w:proofErr w:type="spellStart"/>
-      <w:r>
-        <w:t>Architecture</w:t>
-      </w:r>
-      <w:proofErr w:type="spellEnd"/>
-      <w:r>
-        <w:t xml:space="preserve"> </w:t>
-      </w:r>
-      <w:proofErr w:type="spellStart"/>
-      <w:r>
-        <w:t>pattern</w:t>
-      </w:r>
-      <w:proofErr w:type="spellEnd"/>
-      <w:r>
-        <w:t xml:space="preserve"> </w:t>
-      </w:r>
-      <w:proofErr w:type="spellStart"/>
-      <w:r>
-        <w:t>recommended</w:t>
-      </w:r>
-      <w:proofErr w:type="spellEnd"/>
-      <w:r>
-        <w:t xml:space="preserve"> </w:t>
-      </w:r>
-      <w:proofErr w:type="spellStart"/>
-      <w:r>
-        <w:t>by</w:t>
-      </w:r>
-      <w:proofErr w:type="spellEnd"/>
-      <w:r>
-        <w:t xml:space="preserve"> Google, and </w:t>
-      </w:r>
-      <w:proofErr w:type="spellStart"/>
-      <w:r>
-        <w:t>leverages</w:t>
-      </w:r>
-      <w:proofErr w:type="spellEnd"/>
-      <w:r>
-        <w:t xml:space="preserve"> </w:t>
-      </w:r>
-      <w:proofErr w:type="spellStart"/>
-      <w:r>
-        <w:t>MPAndroidChart</w:t>
-      </w:r>
-      <w:proofErr w:type="spellEnd"/>
-      <w:r>
-        <w:t xml:space="preserve"> </w:t>
-      </w:r>
-      <w:proofErr w:type="spellStart"/>
-      <w:r>
-        <w:t>for</w:t>
-      </w:r>
-      <w:proofErr w:type="spellEnd"/>
-      <w:r>
-        <w:t xml:space="preserve"> </w:t>
-      </w:r>
-      <w:proofErr w:type="spellStart"/>
-      <w:r>
-        <w:t>grouped</w:t>
-      </w:r>
-      <w:proofErr w:type="spellEnd"/>
-      <w:r>
-        <w:t xml:space="preserve"> bar charts </w:t>
-      </w:r>
-      <w:proofErr w:type="spellStart"/>
-      <w:r>
-        <w:t>displaying</w:t>
-      </w:r>
-      <w:proofErr w:type="spellEnd"/>
-      <w:r>
-        <w:t xml:space="preserve"> </w:t>
-      </w:r>
-      <w:proofErr w:type="spellStart"/>
-      <w:r>
-        <w:t>the</w:t>
-      </w:r>
-      <w:proofErr w:type="spellEnd"/>
-      <w:r>
-        <w:t xml:space="preserve"> </w:t>
-      </w:r>
-      <w:proofErr w:type="spellStart"/>
-      <w:r>
-        <w:t>user's</w:t>
-      </w:r>
-      <w:proofErr w:type="spellEnd"/>
-      <w:r>
-        <w:t xml:space="preserve"> </w:t>
-      </w:r>
-      <w:proofErr w:type="spellStart"/>
-      <w:r>
-        <w:t>earned</w:t>
-      </w:r>
-      <w:proofErr w:type="spellEnd"/>
-      <w:r>
-        <w:t>-versus-</w:t>
-      </w:r>
-      <w:proofErr w:type="spellStart"/>
-      <w:r>
-        <w:t>spent</w:t>
-      </w:r>
-      <w:proofErr w:type="spellEnd"/>
-      <w:r>
-        <w:t xml:space="preserve"> </w:t>
-      </w:r>
-      <w:proofErr w:type="spellStart"/>
-      <w:r>
-        <w:t>hour</w:t>
-      </w:r>
-      <w:proofErr w:type="spellEnd"/>
-      <w:r>
-        <w:t xml:space="preserve"> </w:t>
-      </w:r>
-      <w:proofErr w:type="spellStart"/>
-      <w:r>
-        <w:t>history</w:t>
-      </w:r>
-      <w:proofErr w:type="spellEnd"/>
-      <w:r>
-        <w:t xml:space="preserve">. A reactive </w:t>
-      </w:r>
-      <w:proofErr w:type="spellStart"/>
-      <w:r>
-        <w:t>notification</w:t>
-      </w:r>
-      <w:proofErr w:type="spellEnd"/>
-      <w:r>
-        <w:t xml:space="preserve"> </w:t>
-      </w:r>
-      <w:proofErr w:type="spellStart"/>
-      <w:r>
-        <w:t>badge</w:t>
-      </w:r>
-      <w:proofErr w:type="spellEnd"/>
-      <w:r>
-        <w:t xml:space="preserve"> </w:t>
-      </w:r>
-      <w:proofErr w:type="spellStart"/>
-      <w:r>
-        <w:t>informs</w:t>
-      </w:r>
-      <w:proofErr w:type="spellEnd"/>
-      <w:r>
-        <w:t xml:space="preserve"> </w:t>
-      </w:r>
-      <w:proofErr w:type="spellStart"/>
-      <w:r>
-        <w:t>users</w:t>
-      </w:r>
-      <w:proofErr w:type="spellEnd"/>
-      <w:r>
-        <w:t xml:space="preserve"> </w:t>
-      </w:r>
-      <w:proofErr w:type="spellStart"/>
-      <w:r>
-        <w:t>of</w:t>
-      </w:r>
-      <w:proofErr w:type="spellEnd"/>
-      <w:r>
-        <w:t xml:space="preserve"> </w:t>
-      </w:r>
-      <w:proofErr w:type="spellStart"/>
-      <w:r>
-        <w:t>transactions</w:t>
-      </w:r>
-      <w:proofErr w:type="spellEnd"/>
-      <w:r>
-        <w:t xml:space="preserve"> </w:t>
-      </w:r>
-      <w:proofErr w:type="spellStart"/>
-      <w:r>
-        <w:t>requiring</w:t>
-      </w:r>
-      <w:proofErr w:type="spellEnd"/>
-      <w:r>
-        <w:t xml:space="preserve"> </w:t>
-      </w:r>
-      <w:proofErr w:type="spellStart"/>
-      <w:r>
-        <w:t>their</w:t>
-      </w:r>
-      <w:proofErr w:type="spellEnd"/>
-      <w:r>
-        <w:t xml:space="preserve"> </w:t>
-      </w:r>
-      <w:proofErr w:type="spellStart"/>
-      <w:r>
-        <w:t>attention</w:t>
-      </w:r>
-      <w:proofErr w:type="spellEnd"/>
-      <w:r>
-        <w:t xml:space="preserve">. The competitive </w:t>
-      </w:r>
-      <w:proofErr w:type="spellStart"/>
-      <w:r>
-        <w:t>analysis</w:t>
-      </w:r>
-      <w:proofErr w:type="spellEnd"/>
-      <w:r>
-        <w:t xml:space="preserve"> </w:t>
-      </w:r>
-      <w:proofErr w:type="spellStart"/>
-      <w:r>
-        <w:t>conducted</w:t>
-      </w:r>
-      <w:proofErr w:type="spellEnd"/>
-      <w:r>
-        <w:t xml:space="preserve"> </w:t>
-      </w:r>
-      <w:proofErr w:type="spellStart"/>
-      <w:r>
-        <w:t>during</w:t>
-      </w:r>
-      <w:proofErr w:type="spellEnd"/>
-      <w:r>
-        <w:t xml:space="preserve"> </w:t>
-      </w:r>
-      <w:proofErr w:type="spellStart"/>
-      <w:r>
-        <w:t>this</w:t>
-      </w:r>
-      <w:proofErr w:type="spellEnd"/>
-      <w:r>
-        <w:t xml:space="preserve"> </w:t>
-      </w:r>
-      <w:proofErr w:type="spellStart"/>
-      <w:r>
-        <w:t>project</w:t>
-      </w:r>
-      <w:proofErr w:type="spellEnd"/>
-      <w:r>
-        <w:t xml:space="preserve"> </w:t>
-      </w:r>
-      <w:proofErr w:type="spellStart"/>
-      <w:r>
-        <w:t>found</w:t>
-      </w:r>
-      <w:proofErr w:type="spellEnd"/>
-      <w:r>
-        <w:t xml:space="preserve"> no </w:t>
-      </w:r>
-      <w:proofErr w:type="spellStart"/>
-      <w:r>
-        <w:t>existing</w:t>
-      </w:r>
-      <w:proofErr w:type="spellEnd"/>
-      <w:r>
-        <w:t xml:space="preserve"> </w:t>
-      </w:r>
-      <w:proofErr w:type="spellStart"/>
-      <w:r>
-        <w:t>platform</w:t>
-      </w:r>
-      <w:proofErr w:type="spellEnd"/>
-      <w:r>
-        <w:t xml:space="preserve"> </w:t>
-      </w:r>
-      <w:proofErr w:type="spellStart"/>
-      <w:r>
-        <w:t>that</w:t>
-      </w:r>
-      <w:proofErr w:type="spellEnd"/>
-      <w:r>
-        <w:t xml:space="preserve"> combines </w:t>
-      </w:r>
-      <w:proofErr w:type="spellStart"/>
-      <w:r>
-        <w:t>hyperlocal</w:t>
-      </w:r>
-      <w:proofErr w:type="spellEnd"/>
-      <w:r>
-        <w:t xml:space="preserve"> social </w:t>
-      </w:r>
-      <w:proofErr w:type="spellStart"/>
-      <w:r>
-        <w:t>networking</w:t>
-      </w:r>
-      <w:proofErr w:type="spellEnd"/>
-      <w:r>
-        <w:t xml:space="preserve">, time </w:t>
-      </w:r>
-      <w:proofErr w:type="spellStart"/>
-      <w:r>
-        <w:t>banking</w:t>
-      </w:r>
-      <w:proofErr w:type="spellEnd"/>
-      <w:r>
-        <w:t xml:space="preserve">, and </w:t>
-      </w:r>
-      <w:proofErr w:type="spellStart"/>
-      <w:r>
-        <w:t>advanced</w:t>
-      </w:r>
-      <w:proofErr w:type="spellEnd"/>
-      <w:r>
-        <w:t xml:space="preserve"> </w:t>
-      </w:r>
-      <w:proofErr w:type="spellStart"/>
-      <w:r>
-        <w:t>accessibility</w:t>
-      </w:r>
-      <w:proofErr w:type="spellEnd"/>
-      <w:r>
-        <w:t xml:space="preserve"> </w:t>
-      </w:r>
-      <w:proofErr w:type="spellStart"/>
-      <w:r>
-        <w:t>features</w:t>
-      </w:r>
-      <w:proofErr w:type="spellEnd"/>
-      <w:r>
-        <w:t xml:space="preserve"> </w:t>
-      </w:r>
-      <w:proofErr w:type="spellStart"/>
-      <w:r>
-        <w:t>within</w:t>
-      </w:r>
-      <w:proofErr w:type="spellEnd"/>
-      <w:r>
-        <w:t xml:space="preserve"> a </w:t>
-      </w:r>
-      <w:proofErr w:type="gramStart"/>
-      <w:r>
-        <w:t>single</w:t>
-      </w:r>
-      <w:proofErr w:type="gramEnd"/>
-      <w:r>
-        <w:t xml:space="preserve"> </w:t>
-      </w:r>
-      <w:proofErr w:type="spellStart"/>
-      <w:r>
-        <w:t>application</w:t>
-      </w:r>
-      <w:proofErr w:type="spellEnd"/>
-      <w:r>
-        <w:t>.</w:t>
+        <w:rPr>
+          <w:lang w:val="en-GB"/>
+        </w:rPr>
+        <w:t xml:space="preserve"> for grouped bar charts displaying the user's earned-versus-spent hour history. A reactive notification badge informs users of transactions requiring their attention. The competitive analysis conducted during this project found no existing platform that combines hyperlocal social networking, time banking, and advanced accessibility features within a single application.</w:t>
       </w:r>
     </w:p>
     <w:p>
@@ -9178,6 +7977,7 @@
                 <w:bCs/>
                 <w:color w:val="262626"/>
               </w:rPr>
+              <w:lastRenderedPageBreak/>
               <w:t>OE-05</w:t>
             </w:r>
           </w:p>
@@ -11321,7 +10121,7 @@
                     <pic:cNvPicPr preferRelativeResize="0"/>
                   </pic:nvPicPr>
                   <pic:blipFill>
-                    <a:blip r:embed="rId9"/>
+                    <a:blip r:embed="rId10"/>
                     <a:srcRect/>
                     <a:stretch>
                       <a:fillRect/>
@@ -11361,7 +10161,7 @@
                     <pic:cNvPicPr preferRelativeResize="0"/>
                   </pic:nvPicPr>
                   <pic:blipFill>
-                    <a:blip r:embed="rId10"/>
+                    <a:blip r:embed="rId11"/>
                     <a:srcRect/>
                     <a:stretch>
                       <a:fillRect/>
@@ -15313,6 +14113,7 @@
         <w:rPr>
           <w:color w:val="595959"/>
         </w:rPr>
+        <w:lastRenderedPageBreak/>
         <w:t>Tabla 4. Planificación estimada vs. real del proyecto. Elaboración propia</w:t>
       </w:r>
     </w:p>
@@ -15378,7 +14179,7 @@
                     <pic:cNvPicPr preferRelativeResize="0"/>
                   </pic:nvPicPr>
                   <pic:blipFill>
-                    <a:blip r:embed="rId11"/>
+                    <a:blip r:embed="rId12"/>
                     <a:srcRect/>
                     <a:stretch>
                       <a:fillRect/>
@@ -35990,7 +34791,13 @@
         <w:spacing w:before="0" w:after="0"/>
       </w:pPr>
       <w:r>
-        <w:t>Blanco sobre superficies: tarjetas Material (</w:t>
+        <w:t>Blanco</w:t>
+      </w:r>
+      <w:r>
+        <w:t xml:space="preserve"> arena</w:t>
+      </w:r>
+      <w:r>
+        <w:t xml:space="preserve"> sobre superficies: tarjetas Material (</w:t>
       </w:r>
       <w:proofErr w:type="spellStart"/>
       <w:r>
@@ -36144,14 +34951,302 @@
     <w:p>
       <w:pPr>
         <w:spacing w:before="0" w:after="0"/>
+      </w:pPr>
+      <w:r>
+        <w:t>Las pantallas de autenticación siguen un flujo minimalista. El Login pide únicamente el nombre del vecino (sin contraseña, para facilitar la demo multiusuario) y ofrece un enlace directo al Registro. El Registro añade un Spinner con los barrios de Zaragoza predefinidos.</w:t>
+      </w:r>
+    </w:p>
+    <w:tbl>
+      <w:tblPr>
+        <w:tblStyle w:val="Tablaconcuadrcula"/>
+        <w:tblW w:w="0" w:type="auto"/>
+        <w:tblBorders>
+          <w:top w:val="none" w:sz="0" w:space="0" w:color="auto"/>
+          <w:left w:val="none" w:sz="0" w:space="0" w:color="auto"/>
+          <w:bottom w:val="none" w:sz="0" w:space="0" w:color="auto"/>
+          <w:right w:val="none" w:sz="0" w:space="0" w:color="auto"/>
+          <w:insideH w:val="none" w:sz="0" w:space="0" w:color="auto"/>
+          <w:insideV w:val="none" w:sz="0" w:space="0" w:color="auto"/>
+        </w:tblBorders>
+        <w:tblLook w:val="04A0" w:firstRow="1" w:lastRow="0" w:firstColumn="1" w:lastColumn="0" w:noHBand="0" w:noVBand="1"/>
+      </w:tblPr>
+      <w:tblGrid>
+        <w:gridCol w:w="4509"/>
+        <w:gridCol w:w="4510"/>
+      </w:tblGrid>
+      <w:tr>
+        <w:tc>
+          <w:tcPr>
+            <w:tcW w:w="4509" w:type="dxa"/>
+          </w:tcPr>
+          <w:p>
+            <w:pPr>
+              <w:jc w:val="center"/>
+            </w:pPr>
+            <w:r>
+              <w:rPr>
+                <w:noProof/>
+              </w:rPr>
+              <w:drawing>
+                <wp:inline distT="0" distB="0" distL="0" distR="0" wp14:anchorId="1BE8E9AC" wp14:editId="5B26B3C1">
+                  <wp:extent cx="1536590" cy="3368140"/>
+                  <wp:effectExtent l="0" t="0" r="6985" b="3810"/>
+                  <wp:docPr id="446970924" name="Imagen 1"/>
+                  <wp:cNvGraphicFramePr>
+                    <a:graphicFrameLocks xmlns:a="http://schemas.openxmlformats.org/drawingml/2006/main" noChangeAspect="1"/>
+                  </wp:cNvGraphicFramePr>
+                  <a:graphic xmlns:a="http://schemas.openxmlformats.org/drawingml/2006/main">
+                    <a:graphicData uri="http://schemas.openxmlformats.org/drawingml/2006/picture">
+                      <pic:pic xmlns:pic="http://schemas.openxmlformats.org/drawingml/2006/picture">
+                        <pic:nvPicPr>
+                          <pic:cNvPr id="446970924" name="Imagen 446970924"/>
+                          <pic:cNvPicPr/>
+                        </pic:nvPicPr>
+                        <pic:blipFill>
+                          <a:blip r:embed="rId13" cstate="print">
+                            <a:extLst>
+                              <a:ext uri="{28A0092B-C50C-407E-A947-70E740481C1C}">
+                                <a14:useLocalDpi xmlns:a14="http://schemas.microsoft.com/office/drawing/2010/main" val="0"/>
+                              </a:ext>
+                            </a:extLst>
+                          </a:blip>
+                          <a:stretch>
+                            <a:fillRect/>
+                          </a:stretch>
+                        </pic:blipFill>
+                        <pic:spPr>
+                          <a:xfrm>
+                            <a:off x="0" y="0"/>
+                            <a:ext cx="1547839" cy="3392797"/>
+                          </a:xfrm>
+                          <a:prstGeom prst="rect">
+                            <a:avLst/>
+                          </a:prstGeom>
+                        </pic:spPr>
+                      </pic:pic>
+                    </a:graphicData>
+                  </a:graphic>
+                </wp:inline>
+              </w:drawing>
+            </w:r>
+          </w:p>
+        </w:tc>
+        <w:tc>
+          <w:tcPr>
+            <w:tcW w:w="4510" w:type="dxa"/>
+          </w:tcPr>
+          <w:p>
+            <w:pPr>
+              <w:jc w:val="center"/>
+            </w:pPr>
+            <w:r>
+              <w:rPr>
+                <w:noProof/>
+              </w:rPr>
+              <w:drawing>
+                <wp:inline distT="0" distB="0" distL="0" distR="0" wp14:anchorId="0C97D17A" wp14:editId="7EB404BD">
+                  <wp:extent cx="1527564" cy="3348358"/>
+                  <wp:effectExtent l="0" t="0" r="0" b="4445"/>
+                  <wp:docPr id="574612884" name="Imagen 3"/>
+                  <wp:cNvGraphicFramePr>
+                    <a:graphicFrameLocks xmlns:a="http://schemas.openxmlformats.org/drawingml/2006/main" noChangeAspect="1"/>
+                  </wp:cNvGraphicFramePr>
+                  <a:graphic xmlns:a="http://schemas.openxmlformats.org/drawingml/2006/main">
+                    <a:graphicData uri="http://schemas.openxmlformats.org/drawingml/2006/picture">
+                      <pic:pic xmlns:pic="http://schemas.openxmlformats.org/drawingml/2006/picture">
+                        <pic:nvPicPr>
+                          <pic:cNvPr id="574612884" name="Imagen 574612884"/>
+                          <pic:cNvPicPr/>
+                        </pic:nvPicPr>
+                        <pic:blipFill>
+                          <a:blip r:embed="rId14" cstate="print">
+                            <a:extLst>
+                              <a:ext uri="{28A0092B-C50C-407E-A947-70E740481C1C}">
+                                <a14:useLocalDpi xmlns:a14="http://schemas.microsoft.com/office/drawing/2010/main" val="0"/>
+                              </a:ext>
+                            </a:extLst>
+                          </a:blip>
+                          <a:stretch>
+                            <a:fillRect/>
+                          </a:stretch>
+                        </pic:blipFill>
+                        <pic:spPr>
+                          <a:xfrm>
+                            <a:off x="0" y="0"/>
+                            <a:ext cx="1534360" cy="3363254"/>
+                          </a:xfrm>
+                          <a:prstGeom prst="rect">
+                            <a:avLst/>
+                          </a:prstGeom>
+                        </pic:spPr>
+                      </pic:pic>
+                    </a:graphicData>
+                  </a:graphic>
+                </wp:inline>
+              </w:drawing>
+            </w:r>
+          </w:p>
+        </w:tc>
+      </w:tr>
+      <w:tr>
+        <w:trPr>
+          <w:trHeight w:val="373"/>
+        </w:trPr>
+        <w:tc>
+          <w:tcPr>
+            <w:tcW w:w="4509" w:type="dxa"/>
+          </w:tcPr>
+          <w:p>
+            <w:pPr>
+              <w:jc w:val="center"/>
+            </w:pPr>
+            <w:r>
+              <w:t>Captura de la pantalla de Login</w:t>
+            </w:r>
+          </w:p>
+        </w:tc>
+        <w:tc>
+          <w:tcPr>
+            <w:tcW w:w="4510" w:type="dxa"/>
+          </w:tcPr>
+          <w:p>
+            <w:pPr>
+              <w:jc w:val="center"/>
+            </w:pPr>
+            <w:r>
+              <w:t>Captura de la pantalla de Registro</w:t>
+            </w:r>
+          </w:p>
+        </w:tc>
+      </w:tr>
+    </w:tbl>
+    <w:p>
+      <w:pPr>
+        <w:spacing w:before="0" w:after="0"/>
+        <w:jc w:val="center"/>
+      </w:pPr>
+    </w:p>
+    <w:p>
+      <w:pPr>
+        <w:pStyle w:val="Ttulo3"/>
         <w:rPr>
           <w:kern w:val="2"/>
           <w:lang w:val="es-ES"/>
           <w14:ligatures w14:val="standardContextual"/>
         </w:rPr>
       </w:pPr>
-      <w:r>
-        <w:t>Las pantallas de autenticación siguen un flujo minimalista. El Login pide únicamente el nombre del vecino (sin contraseña, para facilitar la demo multiusuario) y ofrece un enlace directo al Registro. El Registro añade un Spinner con los barrios de Zaragoza predefinidos.</w:t>
+      <w:bookmarkStart w:id="42" w:name="_Toc227493723"/>
+      <w:r>
+        <w:lastRenderedPageBreak/>
+        <w:t>Escaparate</w:t>
+      </w:r>
+      <w:bookmarkEnd w:id="42"/>
+    </w:p>
+    <w:p>
+      <w:pPr>
+        <w:spacing w:before="0" w:after="0"/>
+      </w:pPr>
+      <w:r>
+        <w:rPr>
+          <w:noProof/>
+          <w:kern w:val="2"/>
+          <w:lang w:val="es-ES"/>
+        </w:rPr>
+        <w:drawing>
+          <wp:anchor distT="0" distB="0" distL="114300" distR="114300" simplePos="0" relativeHeight="251661312" behindDoc="1" locked="0" layoutInCell="1" allowOverlap="1" wp14:anchorId="380BE35A" wp14:editId="4F5EC1E3">
+            <wp:simplePos x="0" y="0"/>
+            <wp:positionH relativeFrom="margin">
+              <wp:align>left</wp:align>
+            </wp:positionH>
+            <wp:positionV relativeFrom="paragraph">
+              <wp:posOffset>758777</wp:posOffset>
+            </wp:positionV>
+            <wp:extent cx="1468120" cy="3218180"/>
+            <wp:effectExtent l="0" t="0" r="0" b="1270"/>
+            <wp:wrapTight wrapText="bothSides">
+              <wp:wrapPolygon edited="0">
+                <wp:start x="0" y="0"/>
+                <wp:lineTo x="0" y="21481"/>
+                <wp:lineTo x="21301" y="21481"/>
+                <wp:lineTo x="21301" y="0"/>
+                <wp:lineTo x="0" y="0"/>
+              </wp:wrapPolygon>
+            </wp:wrapTight>
+            <wp:docPr id="1422960574" name="Imagen 4"/>
+            <wp:cNvGraphicFramePr>
+              <a:graphicFrameLocks xmlns:a="http://schemas.openxmlformats.org/drawingml/2006/main" noChangeAspect="1"/>
+            </wp:cNvGraphicFramePr>
+            <a:graphic xmlns:a="http://schemas.openxmlformats.org/drawingml/2006/main">
+              <a:graphicData uri="http://schemas.openxmlformats.org/drawingml/2006/picture">
+                <pic:pic xmlns:pic="http://schemas.openxmlformats.org/drawingml/2006/picture">
+                  <pic:nvPicPr>
+                    <pic:cNvPr id="1422960574" name="Imagen 1422960574"/>
+                    <pic:cNvPicPr/>
+                  </pic:nvPicPr>
+                  <pic:blipFill>
+                    <a:blip r:embed="rId15" cstate="print">
+                      <a:extLst>
+                        <a:ext uri="{28A0092B-C50C-407E-A947-70E740481C1C}">
+                          <a14:useLocalDpi xmlns:a14="http://schemas.microsoft.com/office/drawing/2010/main" val="0"/>
+                        </a:ext>
+                      </a:extLst>
+                    </a:blip>
+                    <a:stretch>
+                      <a:fillRect/>
+                    </a:stretch>
+                  </pic:blipFill>
+                  <pic:spPr>
+                    <a:xfrm>
+                      <a:off x="0" y="0"/>
+                      <a:ext cx="1470922" cy="3224206"/>
+                    </a:xfrm>
+                    <a:prstGeom prst="rect">
+                      <a:avLst/>
+                    </a:prstGeom>
+                  </pic:spPr>
+                </pic:pic>
+              </a:graphicData>
+            </a:graphic>
+            <wp14:sizeRelH relativeFrom="margin">
+              <wp14:pctWidth>0</wp14:pctWidth>
+            </wp14:sizeRelH>
+            <wp14:sizeRelV relativeFrom="margin">
+              <wp14:pctHeight>0</wp14:pctHeight>
+            </wp14:sizeRelV>
+          </wp:anchor>
+        </w:drawing>
+      </w:r>
+      <w:r>
+        <w:t xml:space="preserve">Es la pantalla de inicio tras el </w:t>
+      </w:r>
+      <w:proofErr w:type="spellStart"/>
+      <w:r>
+        <w:t>login</w:t>
+      </w:r>
+      <w:proofErr w:type="spellEnd"/>
+      <w:r>
+        <w:t xml:space="preserve">. Muestra un </w:t>
+      </w:r>
+      <w:proofErr w:type="spellStart"/>
+      <w:r>
+        <w:t>RecyclerView</w:t>
+      </w:r>
+      <w:proofErr w:type="spellEnd"/>
+      <w:r>
+        <w:t xml:space="preserve"> de tarjetas con todos los servicios ACTIVOS de la comunidad ordenados por fecha de publicación descendente. Cada tarjeta muestra el título, el coste en horas (con formato humanizado) y un pictograma ARASAAC asignado dinámicamente según la categoría del servicio. Un FAB con icono "+" permite publicar un nuevo servicio, y un segundo FAB con icono de altavoz activa el TTS para leer los servicios visibles en pantalla.</w:t>
+      </w:r>
+    </w:p>
+    <w:p>
+      <w:pPr>
+        <w:spacing w:before="0" w:after="0"/>
+      </w:pPr>
+    </w:p>
+    <w:p>
+      <w:pPr>
+        <w:spacing w:before="0" w:after="0"/>
+      </w:pPr>
+      <w:r>
+        <w:t xml:space="preserve">[Figura X. Captura del Escaparate </w:t>
       </w:r>
     </w:p>
     <w:p>
@@ -36164,65 +35259,341 @@
         </w:rPr>
       </w:pPr>
       <w:r>
-        <w:t>[Figura X. Captura de la pantalla de Login.]</w:t>
+        <w:t xml:space="preserve">con tarjetas de servicios y </w:t>
+      </w:r>
+      <w:proofErr w:type="spellStart"/>
+      <w:r>
+        <w:t>FABs</w:t>
+      </w:r>
+      <w:proofErr w:type="spellEnd"/>
+      <w:r>
+        <w:t>.]</w:t>
       </w:r>
     </w:p>
     <w:p>
       <w:pPr>
-        <w:spacing w:before="0" w:after="0"/>
+        <w:pStyle w:val="Ttulo3"/>
         <w:rPr>
           <w:kern w:val="2"/>
           <w:lang w:val="es-ES"/>
           <w14:ligatures w14:val="standardContextual"/>
         </w:rPr>
       </w:pPr>
-      <w:r>
-        <w:t>[Figura X. Captura de la pantalla de Registro.]</w:t>
-      </w:r>
+      <w:bookmarkStart w:id="43" w:name="_Toc227493724"/>
+      <w:r>
+        <w:t>Crear y Detalle de servicio</w:t>
+      </w:r>
+      <w:bookmarkEnd w:id="43"/>
     </w:p>
     <w:p>
       <w:pPr>
-        <w:pStyle w:val="Ttulo3"/>
+        <w:spacing w:before="0" w:after="0"/>
         <w:rPr>
           <w:kern w:val="2"/>
           <w:lang w:val="es-ES"/>
           <w14:ligatures w14:val="standardContextual"/>
         </w:rPr>
       </w:pPr>
-      <w:bookmarkStart w:id="42" w:name="_Toc227493723"/>
-      <w:r>
-        <w:t>Escaparate</w:t>
-      </w:r>
-      <w:bookmarkEnd w:id="42"/>
+      <w:r>
+        <w:t xml:space="preserve">El formulario de creación de servicio se diseñó priorizando la prevención de errores de entrada. Destaca la decisión de sustituir el campo de texto libre para el coste en horas por un Slider Material con pasos de 0,25 h (es decir, cuartos de hora), con un rango de 0,25 a 8 horas. Esta decisión responde a que permitir valores arbitrarios como "1,37 horas" no tiene sentido en el contexto de un banco de tiempo vecinal. El Slider incluye un </w:t>
+      </w:r>
+      <w:proofErr w:type="spellStart"/>
+      <w:r>
+        <w:t>LabelFormatter</w:t>
+      </w:r>
+      <w:proofErr w:type="spellEnd"/>
+      <w:r>
+        <w:t xml:space="preserve"> que muestra el valor seleccionado con formato humanizado (por ejemplo, "1h 15min") mientras el usuario lo arrastra.</w:t>
+      </w:r>
     </w:p>
     <w:p>
       <w:pPr>
         <w:spacing w:before="0" w:after="0"/>
+      </w:pPr>
+      <w:r>
+        <w:t xml:space="preserve">La pantalla de Detalle del Servicio es el </w:t>
+      </w:r>
+      <w:proofErr w:type="spellStart"/>
+      <w:proofErr w:type="gramStart"/>
+      <w:r>
+        <w:t>hub</w:t>
+      </w:r>
+      <w:proofErr w:type="spellEnd"/>
+      <w:proofErr w:type="gramEnd"/>
+      <w:r>
+        <w:t xml:space="preserve"> central de navegación de la aplicación. Desde cualquier tarjeta del Escaparate, Perfil, Transacciones o Historial se accede a esta pantalla, que a su vez es el único punto desde el cual se puede abrir el </w:t>
+      </w:r>
+      <w:proofErr w:type="spellStart"/>
+      <w:r>
+        <w:t>BottomSheet</w:t>
+      </w:r>
+      <w:proofErr w:type="spellEnd"/>
+      <w:r>
+        <w:t xml:space="preserve"> modal de valoración. Los botones de acción mostrados cambian según el rol del usuario (propietario vs. no propietario) y el estado del servicio (ACTIVO, RESERVADO, COMPLETADO).</w:t>
+      </w:r>
+    </w:p>
+    <w:tbl>
+      <w:tblPr>
+        <w:tblStyle w:val="Tablaconcuadrcula"/>
+        <w:tblW w:w="0" w:type="auto"/>
+        <w:tblLook w:val="04A0" w:firstRow="1" w:lastRow="0" w:firstColumn="1" w:lastColumn="0" w:noHBand="0" w:noVBand="1"/>
+      </w:tblPr>
+      <w:tblGrid>
+        <w:gridCol w:w="4509"/>
+        <w:gridCol w:w="4510"/>
+      </w:tblGrid>
+      <w:tr>
+        <w:tc>
+          <w:tcPr>
+            <w:tcW w:w="4509" w:type="dxa"/>
+          </w:tcPr>
+          <w:p>
+            <w:pPr>
+              <w:jc w:val="center"/>
+              <w:rPr>
+                <w:kern w:val="2"/>
+                <w:lang w:val="es-ES"/>
+                <w14:ligatures w14:val="standardContextual"/>
+              </w:rPr>
+            </w:pPr>
+            <w:r>
+              <w:rPr>
+                <w:noProof/>
+                <w:kern w:val="2"/>
+                <w:lang w:val="es-ES"/>
+              </w:rPr>
+              <w:lastRenderedPageBreak/>
+              <w:drawing>
+                <wp:inline distT="0" distB="0" distL="0" distR="0" wp14:anchorId="5B027D66" wp14:editId="43E67C1B">
+                  <wp:extent cx="1076216" cy="2359026"/>
+                  <wp:effectExtent l="0" t="0" r="0" b="3175"/>
+                  <wp:docPr id="101296416" name="Imagen 5"/>
+                  <wp:cNvGraphicFramePr>
+                    <a:graphicFrameLocks xmlns:a="http://schemas.openxmlformats.org/drawingml/2006/main" noChangeAspect="1"/>
+                  </wp:cNvGraphicFramePr>
+                  <a:graphic xmlns:a="http://schemas.openxmlformats.org/drawingml/2006/main">
+                    <a:graphicData uri="http://schemas.openxmlformats.org/drawingml/2006/picture">
+                      <pic:pic xmlns:pic="http://schemas.openxmlformats.org/drawingml/2006/picture">
+                        <pic:nvPicPr>
+                          <pic:cNvPr id="101296416" name="Imagen 101296416"/>
+                          <pic:cNvPicPr/>
+                        </pic:nvPicPr>
+                        <pic:blipFill>
+                          <a:blip r:embed="rId16" cstate="print">
+                            <a:extLst>
+                              <a:ext uri="{28A0092B-C50C-407E-A947-70E740481C1C}">
+                                <a14:useLocalDpi xmlns:a14="http://schemas.microsoft.com/office/drawing/2010/main" val="0"/>
+                              </a:ext>
+                            </a:extLst>
+                          </a:blip>
+                          <a:stretch>
+                            <a:fillRect/>
+                          </a:stretch>
+                        </pic:blipFill>
+                        <pic:spPr>
+                          <a:xfrm>
+                            <a:off x="0" y="0"/>
+                            <a:ext cx="1098499" cy="2407869"/>
+                          </a:xfrm>
+                          <a:prstGeom prst="rect">
+                            <a:avLst/>
+                          </a:prstGeom>
+                        </pic:spPr>
+                      </pic:pic>
+                    </a:graphicData>
+                  </a:graphic>
+                </wp:inline>
+              </w:drawing>
+            </w:r>
+          </w:p>
+        </w:tc>
+        <w:tc>
+          <w:tcPr>
+            <w:tcW w:w="4510" w:type="dxa"/>
+          </w:tcPr>
+          <w:p>
+            <w:pPr>
+              <w:jc w:val="center"/>
+              <w:rPr>
+                <w:kern w:val="2"/>
+                <w:lang w:val="es-ES"/>
+                <w14:ligatures w14:val="standardContextual"/>
+              </w:rPr>
+            </w:pPr>
+            <w:r>
+              <w:rPr>
+                <w:noProof/>
+                <w:kern w:val="2"/>
+                <w:lang w:val="es-ES"/>
+              </w:rPr>
+              <w:drawing>
+                <wp:inline distT="0" distB="0" distL="0" distR="0" wp14:anchorId="17DE3A4A" wp14:editId="12683C85">
+                  <wp:extent cx="1104752" cy="2421576"/>
+                  <wp:effectExtent l="0" t="0" r="635" b="0"/>
+                  <wp:docPr id="733424804" name="Imagen 6"/>
+                  <wp:cNvGraphicFramePr>
+                    <a:graphicFrameLocks xmlns:a="http://schemas.openxmlformats.org/drawingml/2006/main" noChangeAspect="1"/>
+                  </wp:cNvGraphicFramePr>
+                  <a:graphic xmlns:a="http://schemas.openxmlformats.org/drawingml/2006/main">
+                    <a:graphicData uri="http://schemas.openxmlformats.org/drawingml/2006/picture">
+                      <pic:pic xmlns:pic="http://schemas.openxmlformats.org/drawingml/2006/picture">
+                        <pic:nvPicPr>
+                          <pic:cNvPr id="733424804" name="Imagen 733424804"/>
+                          <pic:cNvPicPr/>
+                        </pic:nvPicPr>
+                        <pic:blipFill>
+                          <a:blip r:embed="rId17" cstate="print">
+                            <a:extLst>
+                              <a:ext uri="{28A0092B-C50C-407E-A947-70E740481C1C}">
+                                <a14:useLocalDpi xmlns:a14="http://schemas.microsoft.com/office/drawing/2010/main" val="0"/>
+                              </a:ext>
+                            </a:extLst>
+                          </a:blip>
+                          <a:stretch>
+                            <a:fillRect/>
+                          </a:stretch>
+                        </pic:blipFill>
+                        <pic:spPr>
+                          <a:xfrm>
+                            <a:off x="0" y="0"/>
+                            <a:ext cx="1126631" cy="2469533"/>
+                          </a:xfrm>
+                          <a:prstGeom prst="rect">
+                            <a:avLst/>
+                          </a:prstGeom>
+                        </pic:spPr>
+                      </pic:pic>
+                    </a:graphicData>
+                  </a:graphic>
+                </wp:inline>
+              </w:drawing>
+            </w:r>
+            <w:r>
+              <w:rPr>
+                <w:noProof/>
+                <w:kern w:val="2"/>
+                <w:lang w:val="es-ES"/>
+              </w:rPr>
+              <w:drawing>
+                <wp:inline distT="0" distB="0" distL="0" distR="0" wp14:anchorId="5A5CA24B" wp14:editId="24D8209F">
+                  <wp:extent cx="1104712" cy="2421484"/>
+                  <wp:effectExtent l="0" t="0" r="635" b="0"/>
+                  <wp:docPr id="1342364716" name="Imagen 7"/>
+                  <wp:cNvGraphicFramePr>
+                    <a:graphicFrameLocks xmlns:a="http://schemas.openxmlformats.org/drawingml/2006/main" noChangeAspect="1"/>
+                  </wp:cNvGraphicFramePr>
+                  <a:graphic xmlns:a="http://schemas.openxmlformats.org/drawingml/2006/main">
+                    <a:graphicData uri="http://schemas.openxmlformats.org/drawingml/2006/picture">
+                      <pic:pic xmlns:pic="http://schemas.openxmlformats.org/drawingml/2006/picture">
+                        <pic:nvPicPr>
+                          <pic:cNvPr id="1342364716" name="Imagen 1342364716"/>
+                          <pic:cNvPicPr/>
+                        </pic:nvPicPr>
+                        <pic:blipFill>
+                          <a:blip r:embed="rId18" cstate="print">
+                            <a:extLst>
+                              <a:ext uri="{28A0092B-C50C-407E-A947-70E740481C1C}">
+                                <a14:useLocalDpi xmlns:a14="http://schemas.microsoft.com/office/drawing/2010/main" val="0"/>
+                              </a:ext>
+                            </a:extLst>
+                          </a:blip>
+                          <a:stretch>
+                            <a:fillRect/>
+                          </a:stretch>
+                        </pic:blipFill>
+                        <pic:spPr>
+                          <a:xfrm>
+                            <a:off x="0" y="0"/>
+                            <a:ext cx="1128533" cy="2473698"/>
+                          </a:xfrm>
+                          <a:prstGeom prst="rect">
+                            <a:avLst/>
+                          </a:prstGeom>
+                        </pic:spPr>
+                      </pic:pic>
+                    </a:graphicData>
+                  </a:graphic>
+                </wp:inline>
+              </w:drawing>
+            </w:r>
+          </w:p>
+        </w:tc>
+      </w:tr>
+      <w:tr>
+        <w:trPr>
+          <w:trHeight w:val="65"/>
+        </w:trPr>
+        <w:tc>
+          <w:tcPr>
+            <w:tcW w:w="4509" w:type="dxa"/>
+          </w:tcPr>
+          <w:p>
+            <w:pPr>
+              <w:jc w:val="center"/>
+              <w:rPr>
+                <w:kern w:val="2"/>
+                <w:lang w:val="es-ES"/>
+                <w14:ligatures w14:val="standardContextual"/>
+              </w:rPr>
+            </w:pPr>
+            <w:r>
+              <w:t>Captura del formulario de creación de servicio con Slider</w:t>
+            </w:r>
+          </w:p>
+          <w:p>
+            <w:pPr>
+              <w:jc w:val="center"/>
+              <w:rPr>
+                <w:kern w:val="2"/>
+                <w:lang w:val="es-ES"/>
+                <w14:ligatures w14:val="standardContextual"/>
+              </w:rPr>
+            </w:pPr>
+          </w:p>
+        </w:tc>
+        <w:tc>
+          <w:tcPr>
+            <w:tcW w:w="4510" w:type="dxa"/>
+          </w:tcPr>
+          <w:p>
+            <w:pPr>
+              <w:jc w:val="center"/>
+            </w:pPr>
+            <w:r>
+              <w:t>Captura del Detalle del Servicio mostrando botones contextuales</w:t>
+            </w:r>
+            <w:r>
+              <w:t>.</w:t>
+            </w:r>
+          </w:p>
+          <w:p>
+            <w:pPr>
+              <w:ind w:firstLine="720"/>
+              <w:jc w:val="center"/>
+              <w:rPr>
+                <w:kern w:val="2"/>
+                <w:lang w:val="es-ES"/>
+                <w14:ligatures w14:val="standardContextual"/>
+              </w:rPr>
+            </w:pPr>
+          </w:p>
+        </w:tc>
+      </w:tr>
+    </w:tbl>
+    <w:p>
+      <w:pPr>
+        <w:pStyle w:val="Ttulo3"/>
         <w:rPr>
           <w:kern w:val="2"/>
           <w:lang w:val="es-ES"/>
           <w14:ligatures w14:val="standardContextual"/>
         </w:rPr>
       </w:pPr>
-      <w:r>
-        <w:t xml:space="preserve">Es la pantalla de inicio tras el </w:t>
-      </w:r>
-      <w:proofErr w:type="spellStart"/>
-      <w:r>
-        <w:t>login</w:t>
-      </w:r>
-      <w:proofErr w:type="spellEnd"/>
-      <w:r>
-        <w:t xml:space="preserve">. Muestra un </w:t>
-      </w:r>
-      <w:proofErr w:type="spellStart"/>
-      <w:r>
-        <w:t>RecyclerView</w:t>
-      </w:r>
-      <w:proofErr w:type="spellEnd"/>
-      <w:r>
-        <w:t xml:space="preserve"> de tarjetas con todos los servicios ACTIVOS de la comunidad ordenados por fecha de publicación descendente. Cada tarjeta muestra el título, el coste en horas (con formato humanizado) y un pictograma ARASAAC asignado dinámicamente según la categoría del servicio. Un FAB con icono "+" permite publicar un nuevo servicio, y un segundo FAB con icono de altavoz activa el TTS para leer los servicios visibles en pantalla.</w:t>
-      </w:r>
+      <w:bookmarkStart w:id="44" w:name="_Toc227493725"/>
+      <w:r>
+        <w:t>Transacciones</w:t>
+      </w:r>
+      <w:bookmarkEnd w:id="44"/>
     </w:p>
     <w:p>
       <w:pPr>
@@ -36234,56 +35605,333 @@
         </w:rPr>
       </w:pPr>
       <w:r>
-        <w:t xml:space="preserve">[Figura X. Captura del Escaparate con tarjetas de servicios y </w:t>
-      </w:r>
-      <w:proofErr w:type="spellStart"/>
-      <w:r>
-        <w:t>FABs</w:t>
-      </w:r>
-      <w:proofErr w:type="spellEnd"/>
-      <w:r>
-        <w:t>.]</w:t>
+        <w:t>La pestaña de Transacciones muestra todas las transacciones activas del usuario, tanto aquellas en las que actúa como comprador como aquellas en las que actúa como vendedor. Se aplicó una diferenciación visual por rol mediante un chip coloreado en la parte superior de cada tarjeta ("Comprador" en azul, "Vendedor" en verde).</w:t>
+      </w:r>
+      <w:r>
+        <w:t xml:space="preserve"> </w:t>
+      </w:r>
+      <w:r>
+        <w:t>Los botones de acción disponibles (Aceptar, Completar, Cancelar, Valorar) se calculan dinámicamente según el estado de la transacción y el rol del usuario.</w:t>
       </w:r>
     </w:p>
     <w:p>
       <w:pPr>
-        <w:pStyle w:val="Ttulo3"/>
+        <w:spacing w:before="0" w:after="0"/>
         <w:rPr>
           <w:kern w:val="2"/>
           <w:lang w:val="es-ES"/>
           <w14:ligatures w14:val="standardContextual"/>
         </w:rPr>
       </w:pPr>
-      <w:bookmarkStart w:id="43" w:name="_Toc227493724"/>
-      <w:r>
-        <w:t>Crear y Detalle de servicio</w:t>
-      </w:r>
-      <w:bookmarkEnd w:id="43"/>
+      <w:r>
+        <w:t xml:space="preserve">Las tarjetas de transacciones canceladas reciben un tratamiento visual específico: se muestran oscurecidas, con el texto tachado mediante </w:t>
+      </w:r>
+      <w:proofErr w:type="spellStart"/>
+      <w:r>
+        <w:t>Paint.STRIKE_THRU_TEXT_FLAG</w:t>
+      </w:r>
+      <w:proofErr w:type="spellEnd"/>
+      <w:r>
+        <w:t xml:space="preserve"> y una leyenda "Sin cargo" que indica que no se ha producido transferencia de horas.</w:t>
+      </w:r>
     </w:p>
     <w:p>
       <w:pPr>
         <w:spacing w:before="0" w:after="0"/>
+      </w:pPr>
+      <w:r>
+        <w:t xml:space="preserve">Un </w:t>
+      </w:r>
+      <w:proofErr w:type="spellStart"/>
+      <w:r>
+        <w:t>badge</w:t>
+      </w:r>
+      <w:proofErr w:type="spellEnd"/>
+      <w:r>
+        <w:t xml:space="preserve"> numérico rojo en la pestaña del </w:t>
+      </w:r>
+      <w:proofErr w:type="spellStart"/>
+      <w:r>
+        <w:t>BottomNav</w:t>
+      </w:r>
+      <w:proofErr w:type="spellEnd"/>
+      <w:r>
+        <w:t xml:space="preserve"> indica al usuario cuántas transacciones requieren su atención (pendientes de aceptar o completadas sin valorar).</w:t>
+      </w:r>
+    </w:p>
+    <w:p>
+      <w:pPr>
+        <w:spacing w:before="0" w:after="0"/>
+      </w:pPr>
+    </w:p>
+    <w:tbl>
+      <w:tblPr>
+        <w:tblStyle w:val="Tablaconcuadrcula"/>
+        <w:tblW w:w="0" w:type="auto"/>
+        <w:tblLook w:val="04A0" w:firstRow="1" w:lastRow="0" w:firstColumn="1" w:lastColumn="0" w:noHBand="0" w:noVBand="1"/>
+      </w:tblPr>
+      <w:tblGrid>
+        <w:gridCol w:w="4509"/>
+        <w:gridCol w:w="4510"/>
+      </w:tblGrid>
+      <w:tr>
+        <w:tc>
+          <w:tcPr>
+            <w:tcW w:w="4509" w:type="dxa"/>
+          </w:tcPr>
+          <w:p>
+            <w:pPr>
+              <w:jc w:val="center"/>
+              <w:rPr>
+                <w:kern w:val="2"/>
+                <w:lang w:val="es-ES"/>
+                <w14:ligatures w14:val="standardContextual"/>
+              </w:rPr>
+            </w:pPr>
+            <w:r>
+              <w:rPr>
+                <w:noProof/>
+                <w:kern w:val="2"/>
+                <w:lang w:val="es-ES"/>
+              </w:rPr>
+              <w:lastRenderedPageBreak/>
+              <w:drawing>
+                <wp:inline distT="0" distB="0" distL="0" distR="0" wp14:anchorId="3FBBC065" wp14:editId="7F57337A">
+                  <wp:extent cx="1277425" cy="2800065"/>
+                  <wp:effectExtent l="0" t="0" r="0" b="635"/>
+                  <wp:docPr id="934106726" name="Imagen 9"/>
+                  <wp:cNvGraphicFramePr>
+                    <a:graphicFrameLocks xmlns:a="http://schemas.openxmlformats.org/drawingml/2006/main" noChangeAspect="1"/>
+                  </wp:cNvGraphicFramePr>
+                  <a:graphic xmlns:a="http://schemas.openxmlformats.org/drawingml/2006/main">
+                    <a:graphicData uri="http://schemas.openxmlformats.org/drawingml/2006/picture">
+                      <pic:pic xmlns:pic="http://schemas.openxmlformats.org/drawingml/2006/picture">
+                        <pic:nvPicPr>
+                          <pic:cNvPr id="934106726" name="Imagen 934106726"/>
+                          <pic:cNvPicPr/>
+                        </pic:nvPicPr>
+                        <pic:blipFill>
+                          <a:blip r:embed="rId19" cstate="print">
+                            <a:extLst>
+                              <a:ext uri="{28A0092B-C50C-407E-A947-70E740481C1C}">
+                                <a14:useLocalDpi xmlns:a14="http://schemas.microsoft.com/office/drawing/2010/main" val="0"/>
+                              </a:ext>
+                            </a:extLst>
+                          </a:blip>
+                          <a:stretch>
+                            <a:fillRect/>
+                          </a:stretch>
+                        </pic:blipFill>
+                        <pic:spPr>
+                          <a:xfrm>
+                            <a:off x="0" y="0"/>
+                            <a:ext cx="1307855" cy="2866767"/>
+                          </a:xfrm>
+                          <a:prstGeom prst="rect">
+                            <a:avLst/>
+                          </a:prstGeom>
+                        </pic:spPr>
+                      </pic:pic>
+                    </a:graphicData>
+                  </a:graphic>
+                </wp:inline>
+              </w:drawing>
+            </w:r>
+            <w:r>
+              <w:rPr>
+                <w:noProof/>
+                <w:kern w:val="2"/>
+                <w:lang w:val="es-ES"/>
+              </w:rPr>
+              <w:drawing>
+                <wp:inline distT="0" distB="0" distL="0" distR="0" wp14:anchorId="1AF1A2B6" wp14:editId="18B8A9CF">
+                  <wp:extent cx="1274885" cy="2794494"/>
+                  <wp:effectExtent l="0" t="0" r="1905" b="6350"/>
+                  <wp:docPr id="1808016403" name="Imagen 10"/>
+                  <wp:cNvGraphicFramePr>
+                    <a:graphicFrameLocks xmlns:a="http://schemas.openxmlformats.org/drawingml/2006/main" noChangeAspect="1"/>
+                  </wp:cNvGraphicFramePr>
+                  <a:graphic xmlns:a="http://schemas.openxmlformats.org/drawingml/2006/main">
+                    <a:graphicData uri="http://schemas.openxmlformats.org/drawingml/2006/picture">
+                      <pic:pic xmlns:pic="http://schemas.openxmlformats.org/drawingml/2006/picture">
+                        <pic:nvPicPr>
+                          <pic:cNvPr id="1808016403" name="Imagen 1808016403"/>
+                          <pic:cNvPicPr/>
+                        </pic:nvPicPr>
+                        <pic:blipFill>
+                          <a:blip r:embed="rId20" cstate="print">
+                            <a:extLst>
+                              <a:ext uri="{28A0092B-C50C-407E-A947-70E740481C1C}">
+                                <a14:useLocalDpi xmlns:a14="http://schemas.microsoft.com/office/drawing/2010/main" val="0"/>
+                              </a:ext>
+                            </a:extLst>
+                          </a:blip>
+                          <a:stretch>
+                            <a:fillRect/>
+                          </a:stretch>
+                        </pic:blipFill>
+                        <pic:spPr>
+                          <a:xfrm>
+                            <a:off x="0" y="0"/>
+                            <a:ext cx="1289205" cy="2825883"/>
+                          </a:xfrm>
+                          <a:prstGeom prst="rect">
+                            <a:avLst/>
+                          </a:prstGeom>
+                        </pic:spPr>
+                      </pic:pic>
+                    </a:graphicData>
+                  </a:graphic>
+                </wp:inline>
+              </w:drawing>
+            </w:r>
+          </w:p>
+        </w:tc>
+        <w:tc>
+          <w:tcPr>
+            <w:tcW w:w="4510" w:type="dxa"/>
+          </w:tcPr>
+          <w:p>
+            <w:pPr>
+              <w:jc w:val="center"/>
+              <w:rPr>
+                <w:kern w:val="2"/>
+                <w:lang w:val="es-ES"/>
+                <w14:ligatures w14:val="standardContextual"/>
+              </w:rPr>
+            </w:pPr>
+            <w:r>
+              <w:rPr>
+                <w:noProof/>
+                <w:kern w:val="2"/>
+                <w:lang w:val="es-ES"/>
+              </w:rPr>
+              <w:drawing>
+                <wp:inline distT="0" distB="0" distL="0" distR="0" wp14:anchorId="2B06896D" wp14:editId="6695B7CA">
+                  <wp:extent cx="1274762" cy="2794224"/>
+                  <wp:effectExtent l="0" t="0" r="1905" b="6350"/>
+                  <wp:docPr id="383473607" name="Imagen 11"/>
+                  <wp:cNvGraphicFramePr>
+                    <a:graphicFrameLocks xmlns:a="http://schemas.openxmlformats.org/drawingml/2006/main" noChangeAspect="1"/>
+                  </wp:cNvGraphicFramePr>
+                  <a:graphic xmlns:a="http://schemas.openxmlformats.org/drawingml/2006/main">
+                    <a:graphicData uri="http://schemas.openxmlformats.org/drawingml/2006/picture">
+                      <pic:pic xmlns:pic="http://schemas.openxmlformats.org/drawingml/2006/picture">
+                        <pic:nvPicPr>
+                          <pic:cNvPr id="383473607" name="Imagen 383473607"/>
+                          <pic:cNvPicPr/>
+                        </pic:nvPicPr>
+                        <pic:blipFill>
+                          <a:blip r:embed="rId21" cstate="print">
+                            <a:extLst>
+                              <a:ext uri="{28A0092B-C50C-407E-A947-70E740481C1C}">
+                                <a14:useLocalDpi xmlns:a14="http://schemas.microsoft.com/office/drawing/2010/main" val="0"/>
+                              </a:ext>
+                            </a:extLst>
+                          </a:blip>
+                          <a:stretch>
+                            <a:fillRect/>
+                          </a:stretch>
+                        </pic:blipFill>
+                        <pic:spPr>
+                          <a:xfrm>
+                            <a:off x="0" y="0"/>
+                            <a:ext cx="1292685" cy="2833511"/>
+                          </a:xfrm>
+                          <a:prstGeom prst="rect">
+                            <a:avLst/>
+                          </a:prstGeom>
+                        </pic:spPr>
+                      </pic:pic>
+                    </a:graphicData>
+                  </a:graphic>
+                </wp:inline>
+              </w:drawing>
+            </w:r>
+          </w:p>
+        </w:tc>
+      </w:tr>
+      <w:tr>
+        <w:trPr>
+          <w:trHeight w:val="1129"/>
+        </w:trPr>
+        <w:tc>
+          <w:tcPr>
+            <w:tcW w:w="4509" w:type="dxa"/>
+          </w:tcPr>
+          <w:p>
+            <w:pPr>
+              <w:jc w:val="center"/>
+              <w:rPr>
+                <w:kern w:val="2"/>
+                <w14:ligatures w14:val="standardContextual"/>
+              </w:rPr>
+            </w:pPr>
+            <w:r>
+              <w:t xml:space="preserve">[Figura X. Captura de la pestaña Transacciones mostrando el </w:t>
+            </w:r>
+            <w:proofErr w:type="spellStart"/>
+            <w:r>
+              <w:t>badge</w:t>
+            </w:r>
+            <w:proofErr w:type="spellEnd"/>
+            <w:r>
+              <w:t xml:space="preserve"> de notificaciones y la </w:t>
+            </w:r>
+            <w:proofErr w:type="gramStart"/>
+            <w:r>
+              <w:t>diferenciación comprador</w:t>
+            </w:r>
+            <w:proofErr w:type="gramEnd"/>
+            <w:r>
+              <w:t>/vendedor.]</w:t>
+            </w:r>
+          </w:p>
+        </w:tc>
+        <w:tc>
+          <w:tcPr>
+            <w:tcW w:w="4510" w:type="dxa"/>
+          </w:tcPr>
+          <w:p>
+            <w:pPr>
+              <w:jc w:val="center"/>
+              <w:rPr>
+                <w:kern w:val="2"/>
+                <w:lang w:val="es-ES"/>
+                <w14:ligatures w14:val="standardContextual"/>
+              </w:rPr>
+            </w:pPr>
+            <w:r>
+              <w:t>[Figura X. Captura con una tarjeta de transacción cancelada (texto tachado y "Sin cargo").]</w:t>
+            </w:r>
+          </w:p>
+          <w:p>
+            <w:pPr>
+              <w:jc w:val="center"/>
+              <w:rPr>
+                <w:kern w:val="2"/>
+                <w:lang w:val="es-ES"/>
+                <w14:ligatures w14:val="standardContextual"/>
+              </w:rPr>
+            </w:pPr>
+          </w:p>
+        </w:tc>
+      </w:tr>
+    </w:tbl>
+    <w:p>
+      <w:pPr>
+        <w:pStyle w:val="Ttulo3"/>
         <w:rPr>
           <w:kern w:val="2"/>
           <w:lang w:val="es-ES"/>
           <w14:ligatures w14:val="standardContextual"/>
         </w:rPr>
       </w:pPr>
-      <w:r>
-        <w:t xml:space="preserve">El formulario de creación de servicio se diseñó priorizando la prevención de errores de entrada. Destaca la decisión de sustituir el campo de texto libre para el coste en horas por un Slider Material con pasos de 0,25 h (es decir, cuartos de hora), con un rango de 0,25 a 8 horas. Esta decisión responde a que permitir valores arbitrarios como "1,37 horas" no tiene sentido en el contexto de un banco de tiempo vecinal. El Slider incluye un </w:t>
-      </w:r>
-      <w:proofErr w:type="spellStart"/>
-      <w:r>
-        <w:t>LabelFormatter</w:t>
-      </w:r>
-      <w:proofErr w:type="spellEnd"/>
-      <w:r>
-        <w:t xml:space="preserve"> que </w:t>
-      </w:r>
-      <w:r>
-        <w:lastRenderedPageBreak/>
-        <w:t>muestra el valor seleccionado con formato humanizado (por ejemplo, "1h 15min") mientras el usuario lo arrastra.</w:t>
-      </w:r>
+      <w:bookmarkStart w:id="45" w:name="_Toc227493726"/>
+      <w:r>
+        <w:t>Valoración con pictogramas ARASAAC</w:t>
+      </w:r>
+      <w:bookmarkEnd w:id="45"/>
     </w:p>
     <w:p>
       <w:pPr>
@@ -36295,17 +35943,15 @@
         </w:rPr>
       </w:pPr>
       <w:r>
-        <w:t xml:space="preserve">La pantalla de Detalle del Servicio es el </w:t>
+        <w:t xml:space="preserve">La valoración se realiza mediante un </w:t>
       </w:r>
       <w:proofErr w:type="spellStart"/>
-      <w:proofErr w:type="gramStart"/>
-      <w:r>
-        <w:t>hub</w:t>
+      <w:r>
+        <w:t>BottomSheet</w:t>
       </w:r>
       <w:proofErr w:type="spellEnd"/>
-      <w:proofErr w:type="gramEnd"/>
-      <w:r>
-        <w:t xml:space="preserve"> central de navegación de la aplicación. Desde cualquier tarjeta del Escaparate, Perfil, Transacciones o Historial se accede a esta pantalla, que a su vez es el único punto desde el cual se puede abrir el </w:t>
+      <w:r>
+        <w:t xml:space="preserve"> modal con 9 pictogramas ARASAAC seleccionables y un campo de texto libre opcional para comentarios. El </w:t>
       </w:r>
       <w:proofErr w:type="spellStart"/>
       <w:r>
@@ -36313,7 +35959,15 @@
       </w:r>
       <w:proofErr w:type="spellEnd"/>
       <w:r>
-        <w:t xml:space="preserve"> modal de valoración. Los botones de acción mostrados cambian según el rol del usuario (propietario vs. no propietario) y el estado del servicio (ACTIVO, RESERVADO, COMPLETADO).</w:t>
+        <w:t xml:space="preserve"> es modal (no se apila en el back </w:t>
+      </w:r>
+      <w:proofErr w:type="spellStart"/>
+      <w:r>
+        <w:t>stack</w:t>
+      </w:r>
+      <w:proofErr w:type="spellEnd"/>
+      <w:r>
+        <w:t>) por diseño: esto permite que al cerrarse el usuario vuelva exactamente a la pantalla desde la que lo invocó, evitando bucles de navegación.</w:t>
       </w:r>
     </w:p>
     <w:p>
@@ -36326,36 +35980,142 @@
         </w:rPr>
       </w:pPr>
       <w:r>
-        <w:t>[Figura X. Captura del formulario de creación de servicio con Slider.]</w:t>
+        <w:rPr>
+          <w:noProof/>
+          <w:kern w:val="2"/>
+          <w:lang w:val="es-ES"/>
+        </w:rPr>
+        <w:drawing>
+          <wp:anchor distT="0" distB="0" distL="114300" distR="114300" simplePos="0" relativeHeight="251662336" behindDoc="1" locked="0" layoutInCell="1" allowOverlap="1" wp14:anchorId="68EB7F46" wp14:editId="5819887B">
+            <wp:simplePos x="0" y="0"/>
+            <wp:positionH relativeFrom="margin">
+              <wp:align>left</wp:align>
+            </wp:positionH>
+            <wp:positionV relativeFrom="paragraph">
+              <wp:posOffset>16510</wp:posOffset>
+            </wp:positionV>
+            <wp:extent cx="1722755" cy="3780155"/>
+            <wp:effectExtent l="0" t="0" r="0" b="0"/>
+            <wp:wrapTight wrapText="bothSides">
+              <wp:wrapPolygon edited="0">
+                <wp:start x="0" y="0"/>
+                <wp:lineTo x="0" y="21444"/>
+                <wp:lineTo x="21258" y="21444"/>
+                <wp:lineTo x="21258" y="0"/>
+                <wp:lineTo x="0" y="0"/>
+              </wp:wrapPolygon>
+            </wp:wrapTight>
+            <wp:docPr id="1024341599" name="Imagen 12"/>
+            <wp:cNvGraphicFramePr>
+              <a:graphicFrameLocks xmlns:a="http://schemas.openxmlformats.org/drawingml/2006/main" noChangeAspect="1"/>
+            </wp:cNvGraphicFramePr>
+            <a:graphic xmlns:a="http://schemas.openxmlformats.org/drawingml/2006/main">
+              <a:graphicData uri="http://schemas.openxmlformats.org/drawingml/2006/picture">
+                <pic:pic xmlns:pic="http://schemas.openxmlformats.org/drawingml/2006/picture">
+                  <pic:nvPicPr>
+                    <pic:cNvPr id="1024341599" name="Imagen 1024341599"/>
+                    <pic:cNvPicPr/>
+                  </pic:nvPicPr>
+                  <pic:blipFill>
+                    <a:blip r:embed="rId22" cstate="print">
+                      <a:extLst>
+                        <a:ext uri="{28A0092B-C50C-407E-A947-70E740481C1C}">
+                          <a14:useLocalDpi xmlns:a14="http://schemas.microsoft.com/office/drawing/2010/main" val="0"/>
+                        </a:ext>
+                      </a:extLst>
+                    </a:blip>
+                    <a:stretch>
+                      <a:fillRect/>
+                    </a:stretch>
+                  </pic:blipFill>
+                  <pic:spPr>
+                    <a:xfrm>
+                      <a:off x="0" y="0"/>
+                      <a:ext cx="1722755" cy="3780155"/>
+                    </a:xfrm>
+                    <a:prstGeom prst="rect">
+                      <a:avLst/>
+                    </a:prstGeom>
+                  </pic:spPr>
+                </pic:pic>
+              </a:graphicData>
+            </a:graphic>
+            <wp14:sizeRelH relativeFrom="margin">
+              <wp14:pctWidth>0</wp14:pctWidth>
+            </wp14:sizeRelH>
+            <wp14:sizeRelV relativeFrom="margin">
+              <wp14:pctHeight>0</wp14:pctHeight>
+            </wp14:sizeRelV>
+          </wp:anchor>
+        </w:drawing>
+      </w:r>
+      <w:r>
+        <w:t>La decisión de utilizar pictogramas en lugar de estrellas numéricas responde al objetivo de accesibilidad cognitiva: se eliminan las barreras que puedan tener usuarios con dificultades para interpretar valoraciones numéricas abstractas, sustituyéndolas por conceptos visuales concretos como "puntual", "amable" o "cumple lo prometido</w:t>
+      </w:r>
+      <w:proofErr w:type="gramStart"/>
+      <w:r>
+        <w:t>".[</w:t>
+      </w:r>
+      <w:proofErr w:type="gramEnd"/>
+      <w:r>
+        <w:t xml:space="preserve">Figura X. Captura del </w:t>
+      </w:r>
+      <w:proofErr w:type="spellStart"/>
+      <w:r>
+        <w:t>BottomSheet</w:t>
+      </w:r>
+      <w:proofErr w:type="spellEnd"/>
+      <w:r>
+        <w:t xml:space="preserve"> de valoración con los 9 pictogramas ARASAAC.]</w:t>
       </w:r>
     </w:p>
     <w:p>
       <w:pPr>
-        <w:spacing w:before="0" w:after="0"/>
+        <w:pStyle w:val="Ttulo3"/>
         <w:rPr>
           <w:kern w:val="2"/>
           <w:lang w:val="es-ES"/>
           <w14:ligatures w14:val="standardContextual"/>
         </w:rPr>
       </w:pPr>
-      <w:r>
-        <w:t>[Figura X. Captura del Detalle del Servicio mostrando botones contextuales.]</w:t>
-      </w:r>
+      <w:bookmarkStart w:id="46" w:name="_Toc227493727"/>
+      <w:r>
+        <w:t>Perfil e Historial</w:t>
+      </w:r>
+      <w:bookmarkEnd w:id="46"/>
     </w:p>
     <w:p>
       <w:pPr>
-        <w:pStyle w:val="Ttulo3"/>
+        <w:spacing w:before="0" w:after="0"/>
         <w:rPr>
           <w:kern w:val="2"/>
           <w:lang w:val="es-ES"/>
           <w14:ligatures w14:val="standardContextual"/>
         </w:rPr>
       </w:pPr>
-      <w:bookmarkStart w:id="44" w:name="_Toc227493725"/>
-      <w:r>
-        <w:t>Transacciones</w:t>
-      </w:r>
-      <w:bookmarkEnd w:id="44"/>
+      <w:r>
+        <w:t xml:space="preserve">El Perfil muestra la información del usuario (nombre, barrio, saldo de horas, nivel y número de intercambios completados) junto con la lista de servicios publicados por él. El nivel del vecino (Novato, Activo, Veterano, Referente) se recalcula </w:t>
+      </w:r>
+      <w:r>
+        <w:lastRenderedPageBreak/>
+        <w:t>automáticamente en función del número de intercambios y se muestra como una tarjeta destacada.</w:t>
+      </w:r>
+    </w:p>
+    <w:p>
+      <w:pPr>
+        <w:spacing w:before="0" w:after="0"/>
+      </w:pPr>
+      <w:r>
+        <w:t xml:space="preserve">El Historial cuenta con dos pestañas (completadas y canceladas) y un gráfico de barras agrupadas generado con </w:t>
+      </w:r>
+      <w:proofErr w:type="spellStart"/>
+      <w:r>
+        <w:t>MPAndroidChart</w:t>
+      </w:r>
+      <w:proofErr w:type="spellEnd"/>
+      <w:r>
+        <w:t xml:space="preserve"> que visualiza el balance mensual de horas ganadas frente a horas gastadas.</w:t>
+      </w:r>
     </w:p>
     <w:p>
       <w:pPr>
@@ -36366,243 +36126,6 @@
           <w14:ligatures w14:val="standardContextual"/>
         </w:rPr>
       </w:pPr>
-      <w:r>
-        <w:t>La pestaña de Transacciones muestra todas las transacciones activas del usuario, tanto aquellas en las que actúa como comprador como aquellas en las que actúa como vendedor. Se aplicó una diferenciación visual por rol mediante un chip coloreado en la parte superior de cada tarjeta ("Comprador" en azul, "Vendedor" en verde).</w:t>
-      </w:r>
-      <w:r>
-        <w:t xml:space="preserve"> </w:t>
-      </w:r>
-      <w:r>
-        <w:t>Los botones de acción disponibles (Aceptar, Completar, Cancelar, Valorar) se calculan dinámicamente según el estado de la transacción y el rol del usuario.</w:t>
-      </w:r>
-    </w:p>
-    <w:p>
-      <w:pPr>
-        <w:spacing w:before="0" w:after="0"/>
-        <w:rPr>
-          <w:kern w:val="2"/>
-          <w:lang w:val="es-ES"/>
-          <w14:ligatures w14:val="standardContextual"/>
-        </w:rPr>
-      </w:pPr>
-      <w:r>
-        <w:t xml:space="preserve">Las tarjetas de transacciones canceladas reciben un tratamiento visual específico: se muestran oscurecidas, con el texto tachado mediante </w:t>
-      </w:r>
-      <w:proofErr w:type="spellStart"/>
-      <w:r>
-        <w:t>Paint.STRIKE_THRU_TEXT_FLAG</w:t>
-      </w:r>
-      <w:proofErr w:type="spellEnd"/>
-      <w:r>
-        <w:t xml:space="preserve"> y una leyenda "Sin cargo" que indica que no se ha producido transferencia de horas.</w:t>
-      </w:r>
-    </w:p>
-    <w:p>
-      <w:pPr>
-        <w:spacing w:before="0" w:after="0"/>
-        <w:rPr>
-          <w:kern w:val="2"/>
-          <w:lang w:val="es-ES"/>
-          <w14:ligatures w14:val="standardContextual"/>
-        </w:rPr>
-      </w:pPr>
-      <w:r>
-        <w:t xml:space="preserve">Un </w:t>
-      </w:r>
-      <w:proofErr w:type="spellStart"/>
-      <w:r>
-        <w:t>badge</w:t>
-      </w:r>
-      <w:proofErr w:type="spellEnd"/>
-      <w:r>
-        <w:t xml:space="preserve"> numérico rojo en la pestaña del </w:t>
-      </w:r>
-      <w:proofErr w:type="spellStart"/>
-      <w:r>
-        <w:t>BottomNav</w:t>
-      </w:r>
-      <w:proofErr w:type="spellEnd"/>
-      <w:r>
-        <w:t xml:space="preserve"> indica al usuario cuántas transacciones requieren su atención (pendientes de aceptar o completadas sin valorar).</w:t>
-      </w:r>
-    </w:p>
-    <w:p>
-      <w:pPr>
-        <w:spacing w:before="0" w:after="0"/>
-        <w:rPr>
-          <w:kern w:val="2"/>
-          <w:lang w:val="es-ES"/>
-          <w14:ligatures w14:val="standardContextual"/>
-        </w:rPr>
-      </w:pPr>
-      <w:r>
-        <w:t xml:space="preserve">[Figura X. Captura de la pestaña Transacciones mostrando el </w:t>
-      </w:r>
-      <w:proofErr w:type="spellStart"/>
-      <w:r>
-        <w:t>badge</w:t>
-      </w:r>
-      <w:proofErr w:type="spellEnd"/>
-      <w:r>
-        <w:t xml:space="preserve"> de notificaciones y la </w:t>
-      </w:r>
-      <w:proofErr w:type="gramStart"/>
-      <w:r>
-        <w:t>diferenciación comprador</w:t>
-      </w:r>
-      <w:proofErr w:type="gramEnd"/>
-      <w:r>
-        <w:t>/vendedor.]</w:t>
-      </w:r>
-    </w:p>
-    <w:p>
-      <w:pPr>
-        <w:spacing w:before="0" w:after="0"/>
-        <w:rPr>
-          <w:kern w:val="2"/>
-          <w:lang w:val="es-ES"/>
-          <w14:ligatures w14:val="standardContextual"/>
-        </w:rPr>
-      </w:pPr>
-      <w:r>
-        <w:t>[Figura X. Captura con una tarjeta de transacción cancelada (texto tachado y "Sin cargo").]</w:t>
-      </w:r>
-    </w:p>
-    <w:p>
-      <w:pPr>
-        <w:pStyle w:val="Ttulo3"/>
-        <w:rPr>
-          <w:kern w:val="2"/>
-          <w:lang w:val="es-ES"/>
-          <w14:ligatures w14:val="standardContextual"/>
-        </w:rPr>
-      </w:pPr>
-      <w:bookmarkStart w:id="45" w:name="_Toc227493726"/>
-      <w:r>
-        <w:t>Valoración con pictogramas ARASAAC</w:t>
-      </w:r>
-      <w:bookmarkEnd w:id="45"/>
-    </w:p>
-    <w:p>
-      <w:pPr>
-        <w:spacing w:before="0" w:after="0"/>
-        <w:rPr>
-          <w:kern w:val="2"/>
-          <w:lang w:val="es-ES"/>
-          <w14:ligatures w14:val="standardContextual"/>
-        </w:rPr>
-      </w:pPr>
-      <w:r>
-        <w:t xml:space="preserve">La valoración se realiza mediante un </w:t>
-      </w:r>
-      <w:proofErr w:type="spellStart"/>
-      <w:r>
-        <w:t>BottomSheet</w:t>
-      </w:r>
-      <w:proofErr w:type="spellEnd"/>
-      <w:r>
-        <w:t xml:space="preserve"> modal con 9 pictogramas ARASAAC seleccionables y un campo de texto libre opcional para comentarios. El </w:t>
-      </w:r>
-      <w:proofErr w:type="spellStart"/>
-      <w:r>
-        <w:t>BottomSheet</w:t>
-      </w:r>
-      <w:proofErr w:type="spellEnd"/>
-      <w:r>
-        <w:t xml:space="preserve"> es modal (no se apila en el back </w:t>
-      </w:r>
-      <w:proofErr w:type="spellStart"/>
-      <w:r>
-        <w:t>stack</w:t>
-      </w:r>
-      <w:proofErr w:type="spellEnd"/>
-      <w:r>
-        <w:t>) por diseño: esto permite que al cerrarse el usuario vuelva exactamente a la pantalla desde la que lo invocó, evitando bucles de navegación.</w:t>
-      </w:r>
-    </w:p>
-    <w:p>
-      <w:pPr>
-        <w:spacing w:before="0" w:after="0"/>
-        <w:rPr>
-          <w:kern w:val="2"/>
-          <w:lang w:val="es-ES"/>
-          <w14:ligatures w14:val="standardContextual"/>
-        </w:rPr>
-      </w:pPr>
-      <w:r>
-        <w:t>La decisión de utilizar pictogramas en lugar de estrellas numéricas responde al objetivo de accesibilidad cognitiva: se eliminan las barreras que puedan tener usuarios con dificultades para interpretar valoraciones numéricas abstractas, sustituyéndolas por conceptos visuales concretos como "puntual", "amable" o "cumple lo prometido".</w:t>
-      </w:r>
-    </w:p>
-    <w:p>
-      <w:pPr>
-        <w:spacing w:before="0" w:after="0"/>
-        <w:rPr>
-          <w:kern w:val="2"/>
-          <w:lang w:val="es-ES"/>
-          <w14:ligatures w14:val="standardContextual"/>
-        </w:rPr>
-      </w:pPr>
-      <w:r>
-        <w:t xml:space="preserve">[Figura X. Captura del </w:t>
-      </w:r>
-      <w:proofErr w:type="spellStart"/>
-      <w:r>
-        <w:t>BottomSheet</w:t>
-      </w:r>
-      <w:proofErr w:type="spellEnd"/>
-      <w:r>
-        <w:t xml:space="preserve"> de valoración con los 9 pictogramas ARASAAC.]</w:t>
-      </w:r>
-    </w:p>
-    <w:p>
-      <w:pPr>
-        <w:pStyle w:val="Ttulo3"/>
-        <w:rPr>
-          <w:kern w:val="2"/>
-          <w:lang w:val="es-ES"/>
-          <w14:ligatures w14:val="standardContextual"/>
-        </w:rPr>
-      </w:pPr>
-      <w:bookmarkStart w:id="46" w:name="_Toc227493727"/>
-      <w:r>
-        <w:lastRenderedPageBreak/>
-        <w:t>Perfil e Historial</w:t>
-      </w:r>
-      <w:bookmarkEnd w:id="46"/>
-    </w:p>
-    <w:p>
-      <w:pPr>
-        <w:spacing w:before="0" w:after="0"/>
-        <w:rPr>
-          <w:kern w:val="2"/>
-          <w:lang w:val="es-ES"/>
-          <w14:ligatures w14:val="standardContextual"/>
-        </w:rPr>
-      </w:pPr>
-      <w:r>
-        <w:t>El Perfil muestra la información del usuario (nombre, barrio, saldo de horas, nivel y número de intercambios completados) junto con la lista de servicios publicados por él. El nivel del vecino (Novato, Activo, Veterano, Referente) se recalcula automáticamente en función del número de intercambios y se muestra como una tarjeta destacada.</w:t>
-      </w:r>
-    </w:p>
-    <w:p>
-      <w:pPr>
-        <w:spacing w:before="0" w:after="0"/>
-        <w:rPr>
-          <w:kern w:val="2"/>
-          <w:lang w:val="es-ES"/>
-          <w14:ligatures w14:val="standardContextual"/>
-        </w:rPr>
-      </w:pPr>
-      <w:r>
-        <w:t xml:space="preserve">El Historial cuenta con dos pestañas (completadas y canceladas) y un gráfico de barras agrupadas generado con </w:t>
-      </w:r>
-      <w:proofErr w:type="spellStart"/>
-      <w:r>
-        <w:t>MPAndroidChart</w:t>
-      </w:r>
-      <w:proofErr w:type="spellEnd"/>
-      <w:r>
-        <w:t xml:space="preserve"> que visualiza el balance mensual de horas ganadas frente a horas gastadas.</w:t>
-      </w:r>
     </w:p>
     <w:p>
       <w:pPr>
@@ -36798,7 +36321,6 @@
           <w:b/>
           <w:bCs/>
         </w:rPr>
-        <w:lastRenderedPageBreak/>
         <w:t>Feedback</w:t>
       </w:r>
       <w:proofErr w:type="spellEnd"/>
@@ -36842,7 +36364,11 @@
       </w:r>
       <w:proofErr w:type="spellEnd"/>
       <w:r>
-        <w:t xml:space="preserve"> Material, aprovechando su comportamiento contextual (aparecen en la parte inferior de la pantalla, pueden incluir acciones) y su mejor integración visual con la paleta de la aplicación. Los </w:t>
+        <w:t xml:space="preserve"> Material, aprovechando su comportamiento contextual (aparecen en la parte inferior de la pantalla, pueden incluir acciones) y su mejor integración visual con </w:t>
+      </w:r>
+      <w:r>
+        <w:lastRenderedPageBreak/>
+        <w:t xml:space="preserve">la paleta de la aplicación. Los </w:t>
       </w:r>
       <w:proofErr w:type="spellStart"/>
       <w:r>
@@ -37181,7 +36707,6 @@
       </w:pPr>
       <w:bookmarkStart w:id="51" w:name="_Toc227493732"/>
       <w:r>
-        <w:lastRenderedPageBreak/>
         <w:t>Instalación en dispositivo</w:t>
       </w:r>
       <w:bookmarkEnd w:id="51"/>
@@ -37249,6 +36774,7 @@
         </w:rPr>
       </w:pPr>
       <w:r>
+        <w:lastRenderedPageBreak/>
         <w:t>Este comando requiere tener previamente habilitadas las Opciones de desarrollador y la Depuración USB en el dispositivo Android, así como aceptar la huella digital del ordenador la primera vez que se conecta. Alternativamente, el APK puede transferirse manualmente al dispositivo y abrirse desde cualquier explorador de archivos, lo que permite distribuirlo sin depender de Android Studio.</w:t>
       </w:r>
     </w:p>
@@ -37408,11 +36934,7 @@
         </w:rPr>
       </w:pPr>
       <w:r>
-        <w:t xml:space="preserve">Se valoró la posibilidad de publicar la aplicación en Google Play Store para facilitar su distribución, pero finalmente se descartó por dos razones. La primera, de índole económica: la licencia de desarrollador de Google tiene un coste único de 25 dólares (recientemente actualizada) y requiere una revisión inicial que puede llevar entre 3 y 7 días, tiempo no disponible dentro del calendario del TFG. La segunda, de índole práctica: tratándose de un MVP académico, la aplicación se entrega como APK directamente instalable, lo que facilita </w:t>
-      </w:r>
-      <w:r>
-        <w:lastRenderedPageBreak/>
-        <w:t>que el tribunal pueda probarla sin necesidad de crear cuentas, instalar tiendas alternativas o aceptar términos comerciales. Esta vía de distribución se contempla como mejora en el apartado de Vías Futuras.</w:t>
+        <w:t>Se valoró la posibilidad de publicar la aplicación en Google Play Store para facilitar su distribución, pero finalmente se descartó por dos razones. La primera, de índole económica: la licencia de desarrollador de Google tiene un coste único de 25 dólares (recientemente actualizada) y requiere una revisión inicial que puede llevar entre 3 y 7 días, tiempo no disponible dentro del calendario del TFG. La segunda, de índole práctica: tratándose de un MVP académico, la aplicación se entrega como APK directamente instalable, lo que facilita que el tribunal pueda probarla sin necesidad de crear cuentas, instalar tiendas alternativas o aceptar términos comerciales. Esta vía de distribución se contempla como mejora en el apartado de Vías Futuras.</w:t>
       </w:r>
     </w:p>
     <w:p>
@@ -37426,6 +36948,7 @@
       </w:pPr>
       <w:bookmarkStart w:id="54" w:name="_Toc227493735"/>
       <w:r>
+        <w:lastRenderedPageBreak/>
         <w:t>8.2. Estrategia de pruebas</w:t>
       </w:r>
       <w:bookmarkEnd w:id="54"/>
@@ -37624,7 +37147,6 @@
         </w:rPr>
       </w:pPr>
       <w:r>
-        <w:lastRenderedPageBreak/>
         <w:t>Como</w:t>
       </w:r>
       <w:r>
@@ -37680,6 +37202,7 @@
       </w:pPr>
       <w:bookmarkStart w:id="57" w:name="_Toc227493738"/>
       <w:r>
+        <w:lastRenderedPageBreak/>
         <w:t>Enfoque iterativo: el ejemplo de la valoración unidireccional</w:t>
       </w:r>
       <w:bookmarkEnd w:id="57"/>
@@ -38758,7 +38281,6 @@
               <w:spacing w:before="0" w:after="0" w:line="240" w:lineRule="auto"/>
             </w:pPr>
             <w:r>
-              <w:lastRenderedPageBreak/>
               <w:t>CU-06</w:t>
             </w:r>
           </w:p>
@@ -39044,6 +38566,7 @@
               <w:spacing w:before="0" w:after="0" w:line="240" w:lineRule="auto"/>
             </w:pPr>
             <w:r>
+              <w:lastRenderedPageBreak/>
               <w:t>CU-08</w:t>
             </w:r>
           </w:p>
@@ -40087,26 +39610,52 @@
           <w:p>
             <w:pPr>
               <w:spacing w:before="0" w:after="0" w:line="240" w:lineRule="auto"/>
-            </w:pPr>
-            <w:r>
-              <w:t xml:space="preserve">Foreign Key </w:t>
+              <w:rPr>
+                <w:lang w:val="en-GB"/>
+              </w:rPr>
+            </w:pPr>
+            <w:r>
+              <w:rPr>
+                <w:lang w:val="en-GB"/>
+              </w:rPr>
+              <w:t xml:space="preserve">Foreign Key constraint failed al </w:t>
             </w:r>
             <w:proofErr w:type="spellStart"/>
             <w:r>
-              <w:t>constraint</w:t>
+              <w:rPr>
+                <w:lang w:val="en-GB"/>
+              </w:rPr>
+              <w:t>crear</w:t>
             </w:r>
             <w:proofErr w:type="spellEnd"/>
             <w:r>
+              <w:rPr>
+                <w:lang w:val="en-GB"/>
+              </w:rPr>
               <w:t xml:space="preserve"> </w:t>
             </w:r>
             <w:proofErr w:type="spellStart"/>
             <w:r>
-              <w:t>failed</w:t>
+              <w:rPr>
+                <w:lang w:val="en-GB"/>
+              </w:rPr>
+              <w:t>el</w:t>
             </w:r>
             <w:proofErr w:type="spellEnd"/>
             <w:r>
-              <w:t xml:space="preserve"> al crear el primer servicio</w:t>
-            </w:r>
+              <w:rPr>
+                <w:lang w:val="en-GB"/>
+              </w:rPr>
+              <w:t xml:space="preserve"> primer </w:t>
+            </w:r>
+            <w:proofErr w:type="spellStart"/>
+            <w:r>
+              <w:rPr>
+                <w:lang w:val="en-GB"/>
+              </w:rPr>
+              <w:t>servicio</w:t>
+            </w:r>
+            <w:proofErr w:type="spellEnd"/>
           </w:p>
         </w:tc>
         <w:tc>
@@ -40427,41 +39976,57 @@
           <w:p>
             <w:pPr>
               <w:spacing w:before="0" w:after="0" w:line="240" w:lineRule="auto"/>
-            </w:pPr>
-            <w:r>
-              <w:t xml:space="preserve">Crash en arranque: "You </w:t>
+              <w:rPr>
+                <w:lang w:val="en-GB"/>
+              </w:rPr>
+            </w:pPr>
+            <w:r>
+              <w:rPr>
+                <w:lang w:val="en-GB"/>
+              </w:rPr>
+              <w:t xml:space="preserve">Crash </w:t>
             </w:r>
             <w:proofErr w:type="spellStart"/>
             <w:r>
-              <w:t>need</w:t>
+              <w:rPr>
+                <w:lang w:val="en-GB"/>
+              </w:rPr>
+              <w:t>en</w:t>
             </w:r>
             <w:proofErr w:type="spellEnd"/>
             <w:r>
+              <w:rPr>
+                <w:lang w:val="en-GB"/>
+              </w:rPr>
               <w:t xml:space="preserve"> </w:t>
             </w:r>
             <w:proofErr w:type="spellStart"/>
             <w:r>
-              <w:t>to</w:t>
+              <w:rPr>
+                <w:lang w:val="en-GB"/>
+              </w:rPr>
+              <w:t>arranque</w:t>
             </w:r>
             <w:proofErr w:type="spellEnd"/>
             <w:r>
-              <w:t xml:space="preserve"> use a </w:t>
+              <w:rPr>
+                <w:lang w:val="en-GB"/>
+              </w:rPr>
+              <w:t xml:space="preserve">: "You need to use a </w:t>
             </w:r>
             <w:proofErr w:type="spellStart"/>
             <w:r>
+              <w:rPr>
+                <w:lang w:val="en-GB"/>
+              </w:rPr>
               <w:t>Theme.AppCompat</w:t>
             </w:r>
             <w:proofErr w:type="spellEnd"/>
             <w:r>
-              <w:t xml:space="preserve"> </w:t>
-            </w:r>
-            <w:proofErr w:type="spellStart"/>
-            <w:r>
-              <w:t>theme</w:t>
-            </w:r>
-            <w:proofErr w:type="spellEnd"/>
-            <w:r>
-              <w:t>"</w:t>
+              <w:rPr>
+                <w:lang w:val="en-GB"/>
+              </w:rPr>
+              <w:t xml:space="preserve"> theme"</w:t>
             </w:r>
           </w:p>
         </w:tc>
@@ -40708,7 +40273,6 @@
               <w:spacing w:before="0" w:after="0" w:line="240" w:lineRule="auto"/>
             </w:pPr>
             <w:r>
-              <w:lastRenderedPageBreak/>
               <w:t>BUG-05</w:t>
             </w:r>
           </w:p>
@@ -41028,6 +40592,7 @@
               <w:spacing w:before="0" w:after="0" w:line="240" w:lineRule="auto"/>
             </w:pPr>
             <w:r>
+              <w:lastRenderedPageBreak/>
               <w:t>BUG-07</w:t>
             </w:r>
           </w:p>
@@ -41431,28 +40996,63 @@
           <w:p>
             <w:pPr>
               <w:spacing w:before="0" w:after="0" w:line="240" w:lineRule="auto"/>
-            </w:pPr>
-            <w:r>
+              <w:rPr>
+                <w:lang w:val="en-GB"/>
+              </w:rPr>
+            </w:pPr>
+            <w:r>
+              <w:rPr>
+                <w:lang w:val="en-GB"/>
+              </w:rPr>
               <w:t xml:space="preserve">Cambiar </w:t>
             </w:r>
             <w:proofErr w:type="spellStart"/>
             <w:r>
+              <w:rPr>
+                <w:lang w:val="en-GB"/>
+              </w:rPr>
               <w:t>wrap_content</w:t>
             </w:r>
             <w:proofErr w:type="spellEnd"/>
             <w:r>
-              <w:t xml:space="preserve"> por </w:t>
+              <w:rPr>
+                <w:lang w:val="en-GB"/>
+              </w:rPr>
+              <w:t xml:space="preserve"> </w:t>
             </w:r>
             <w:proofErr w:type="spellStart"/>
             <w:r>
+              <w:rPr>
+                <w:lang w:val="en-GB"/>
+              </w:rPr>
+              <w:t>por</w:t>
+            </w:r>
+            <w:proofErr w:type="spellEnd"/>
+            <w:r>
+              <w:rPr>
+                <w:lang w:val="en-GB"/>
+              </w:rPr>
+              <w:t xml:space="preserve"> </w:t>
+            </w:r>
+            <w:proofErr w:type="spellStart"/>
+            <w:r>
+              <w:rPr>
+                <w:lang w:val="en-GB"/>
+              </w:rPr>
               <w:t>match_parent</w:t>
             </w:r>
             <w:proofErr w:type="spellEnd"/>
             <w:r>
+              <w:rPr>
+                <w:lang w:val="en-GB"/>
+              </w:rPr>
               <w:t xml:space="preserve"> con </w:t>
             </w:r>
             <w:proofErr w:type="spellStart"/>
             <w:r>
+              <w:rPr>
+                <w:lang w:val="en-GB"/>
+              </w:rPr>
               <w:t>autoSizeMinTextSize</w:t>
             </w:r>
             <w:proofErr w:type="spellEnd"/>
@@ -42665,11 +42265,7 @@
             </w:r>
             <w:proofErr w:type="spellEnd"/>
             <w:r>
-              <w:t xml:space="preserve"> de valoración al </w:t>
-            </w:r>
-            <w:r>
-              <w:lastRenderedPageBreak/>
-              <w:t>completar transacción</w:t>
+              <w:t xml:space="preserve"> de valoración al completar transacción</w:t>
             </w:r>
           </w:p>
         </w:tc>
@@ -42697,7 +42293,6 @@
               <w:spacing w:before="0" w:after="0" w:line="240" w:lineRule="auto"/>
             </w:pPr>
             <w:r>
-              <w:lastRenderedPageBreak/>
               <w:t xml:space="preserve">Eliminar </w:t>
             </w:r>
             <w:proofErr w:type="spellStart"/>
@@ -43028,6 +42623,7 @@
         </w:rPr>
       </w:pPr>
       <w:r>
+        <w:lastRenderedPageBreak/>
         <w:t xml:space="preserve">[Figura X. Captura del </w:t>
       </w:r>
       <w:proofErr w:type="spellStart"/>
@@ -43342,7 +42938,6 @@
         <w:spacing w:before="0" w:after="0"/>
       </w:pPr>
       <w:r>
-        <w:lastRenderedPageBreak/>
         <w:t>Usuario B explora el escaparate y comprueba que el servicio aparece en primera posición.</w:t>
       </w:r>
     </w:p>
@@ -43379,6 +42974,7 @@
         <w:spacing w:before="0" w:after="0"/>
       </w:pPr>
       <w:r>
+        <w:lastRenderedPageBreak/>
         <w:t xml:space="preserve">Se cierra sesión. Usuario A inicia sesión y ve la transacción en la pestaña Transacciones con un </w:t>
       </w:r>
       <w:proofErr w:type="spellStart"/>
@@ -43635,7 +43231,6 @@
       </w:pPr>
       <w:bookmarkStart w:id="62" w:name="_Toc227493743"/>
       <w:r>
-        <w:lastRenderedPageBreak/>
         <w:t>8.6. Limitaciones del proceso de pruebas</w:t>
       </w:r>
       <w:bookmarkEnd w:id="62"/>
@@ -43746,6 +43341,7 @@
           <w:b/>
           <w:bCs/>
         </w:rPr>
+        <w:lastRenderedPageBreak/>
         <w:t>Pruebas en un único dispositivo físico:</w:t>
       </w:r>
       <w:r>
@@ -43918,11 +43514,7 @@
       </w:r>
       <w:proofErr w:type="spellEnd"/>
       <w:r>
-        <w:t xml:space="preserve"> ha escalado desde las 13 clases iniciales del diseño previo hasta aproximadamente 45 clases organizadas </w:t>
-      </w:r>
-      <w:r>
-        <w:lastRenderedPageBreak/>
-        <w:t>en cuatro capas, manteniendo la separación de responsabilidades sin degradación apreciable del rendimiento.</w:t>
+        <w:t xml:space="preserve"> ha escalado desde las 13 clases iniciales del diseño previo hasta aproximadamente 45 clases organizadas en cuatro capas, manteniendo la separación de responsabilidades sin degradación apreciable del rendimiento.</w:t>
       </w:r>
     </w:p>
     <w:p>
@@ -43935,7 +43527,11 @@
         </w:rPr>
       </w:pPr>
       <w:r>
-        <w:t xml:space="preserve">Cabe destacar que varios de estos objetivos se superaron en alcance respecto a lo planificado inicialmente. El TTS, que en la propuesta original se limitaba a leer título y descripción de los servicios, acabó integrándose en las cuatro pantallas principales con formateo humanizado de horas y adaptación contextual (por ejemplo, distinguiendo entre "valoración enviada" y "valoración recibida"). El sistema de valoraciones, que inicialmente contemplaba valoraciones bidireccionales automáticas al completar la transacción, evolucionó durante las pruebas funcionales hacia un modelo unidireccional y voluntario más coherente con la lógica real de un banco de tiempo (inspirado en plataformas como BlaBlaCar). Y el sistema de notificaciones, originalmente pensado como tarjetas estáticas, terminó implementándose como un </w:t>
+        <w:t xml:space="preserve">Cabe destacar que varios de estos objetivos se superaron en alcance respecto a lo planificado inicialmente. El TTS, que en la propuesta original se limitaba a leer título y descripción de los servicios, acabó integrándose en las cuatro pantallas principales con formateo humanizado de horas y adaptación contextual (por ejemplo, distinguiendo entre "valoración enviada" y "valoración recibida"). El sistema de valoraciones, que inicialmente contemplaba valoraciones bidireccionales automáticas al completar la transacción, evolucionó durante las pruebas </w:t>
+      </w:r>
+      <w:r>
+        <w:lastRenderedPageBreak/>
+        <w:t xml:space="preserve">funcionales hacia un modelo unidireccional y voluntario más coherente con la lógica real de un banco de tiempo (inspirado en plataformas como BlaBlaCar). Y el sistema de notificaciones, originalmente pensado como tarjetas estáticas, terminó implementándose como un </w:t>
       </w:r>
       <w:proofErr w:type="spellStart"/>
       <w:r>
@@ -44123,7 +43719,6 @@
       </w:pPr>
       <w:bookmarkStart w:id="66" w:name="_Toc227493747"/>
       <w:r>
-        <w:lastRenderedPageBreak/>
         <w:t>9.3. Experiencia vivida y dificultades</w:t>
       </w:r>
       <w:r>
@@ -44149,7 +43744,11 @@
       </w:r>
       <w:proofErr w:type="spellEnd"/>
       <w:r>
-        <w:t xml:space="preserve"> de una semana se vio en la práctica distorsionada por la disponibilidad real de tiempo: había jornadas en las que apenas se podía dedicar una hora al desarrollo, seguidas de fines de semana con sesiones largas en las que se avanzaba más de lo previsto. El uso intensivo del diario de desarrollo (memorias.txt) ha sido fundamental para no perder el hilo entre sesiones y para poder retomar exactamente donde se había dejado el trabajo, algo que considero una de las mejores decisiones metodológicas del proyecto.</w:t>
+        <w:t xml:space="preserve"> de una semana se vio en la práctica distorsionada por la disponibilidad real de tiempo: había jornadas en las que apenas se podía dedicar una hora al desarrollo, seguidas de fines de semana con sesiones largas en las que se avanzaba más de lo previsto. El uso intensivo del diario de desarrollo (memorias.txt) ha sido fundamental para no perder el hilo entre sesiones y para poder retomar </w:t>
+      </w:r>
+      <w:r>
+        <w:lastRenderedPageBreak/>
+        <w:t>exactamente donde se había dejado el trabajo, algo que considero una de las mejores decisiones metodológicas del proyecto.</w:t>
       </w:r>
     </w:p>
     <w:p>
@@ -44319,11 +43918,7 @@
         </w:rPr>
       </w:pPr>
       <w:r>
-        <w:t xml:space="preserve">En lo puramente personal, este proyecto ha supuesto el primer trabajo técnico de envergadura que he afrontado. Al principio costaba saber por dónde empezar ("no sabía si </w:t>
-      </w:r>
-      <w:r>
-        <w:lastRenderedPageBreak/>
-        <w:t xml:space="preserve">ponerme con el diseño de la base de datos o con las interfaces en XML"), y el proceso de redactar la memoria ha sido prácticamente tan complejo como el propio desarrollo de la aplicación. Sin embargo, el proceso de escritura ha servido para organizar el conocimiento adquirido y para cerrar cada capítulo con la sensación de que efectivamente se ha aprendido algo concreto. Algunas decisiones técnicas que al comienzo parecían obvias (como permitir que los repositorios se llamasen entre sí) se revelaron incorrectas al estudiar a fondo los principios de </w:t>
+        <w:t xml:space="preserve">En lo puramente personal, este proyecto ha supuesto el primer trabajo técnico de envergadura que he afrontado. Al principio costaba saber por dónde empezar ("no sabía si ponerme con el diseño de la base de datos o con las interfaces en XML"), y el proceso de redactar la memoria ha sido prácticamente tan complejo como el propio desarrollo de la aplicación. Sin embargo, el proceso de escritura ha servido para organizar el conocimiento adquirido y para cerrar cada capítulo con la sensación de que efectivamente se ha aprendido algo concreto. Algunas decisiones técnicas que al comienzo parecían obvias (como permitir que los repositorios se llamasen entre sí) se revelaron incorrectas al estudiar a fondo los principios de </w:t>
       </w:r>
       <w:proofErr w:type="spellStart"/>
       <w:r>
@@ -44344,6 +43939,7 @@
         </w:rPr>
       </w:pPr>
       <w:r>
+        <w:lastRenderedPageBreak/>
         <w:t>En conjunto, el balance es muy positivo. El MVP entregado cumple con todos los objetivos específicos propuestos y va más allá en varios de ellos; la arquitectura del código permite incorporar las funcionalidades de Vías Futuras sin necesidad de refactorizaciones profundas; y la experiencia de haber abordado un proyecto completo desde el diseño inicial hasta el despliegue final deja un aprendizaje que excede con mucho lo adquirido en las asignaturas individuales del CFGS.</w:t>
       </w:r>
     </w:p>
@@ -45609,8 +45205,16 @@
         <w:t>Encuesta de Condiciones de Vida (ECV). Año 2024. Resultados definitivos</w:t>
       </w:r>
       <w:r>
-        <w:t>. https://ine.es/dyngs/Prensa/es/ECV2024.htm</w:t>
-      </w:r>
+        <w:t xml:space="preserve">. </w:t>
+      </w:r>
+      <w:hyperlink r:id="rId23" w:history="1">
+        <w:r>
+          <w:rPr>
+            <w:rStyle w:val="Hipervnculo"/>
+          </w:rPr>
+          <w:t>https://ine.es/dyngs/Prensa/es/ECV2024.htm</w:t>
+        </w:r>
+      </w:hyperlink>
     </w:p>
     <w:p>
       <w:pPr>
@@ -45632,8 +45236,16 @@
         <w:t>Informe AROPE 2023: El Estado de la Pobreza. Seguimiento del indicador de pobreza y exclusión social en España 2008-2022</w:t>
       </w:r>
       <w:r>
-        <w:t>. EAPN España. https://www.eapn.es/ARCHIVO/documentos/documentos/1698046532_informe_arope-2023_completo.pdf</w:t>
-      </w:r>
+        <w:t xml:space="preserve">. EAPN España. </w:t>
+      </w:r>
+      <w:hyperlink r:id="rId24" w:history="1">
+        <w:r>
+          <w:rPr>
+            <w:rStyle w:val="Hipervnculo"/>
+          </w:rPr>
+          <w:t>https://www.eapn.es/ARCHIVO/documentos/documentos/1698046532_informe_arope-2023_completo.pdf</w:t>
+        </w:r>
+      </w:hyperlink>
     </w:p>
     <w:p>
       <w:pPr>
@@ -45684,8 +45296,16 @@
         <w:t>: Publicaciones e informes sobre pobreza y exclusión social en Europa</w:t>
       </w:r>
       <w:r>
-        <w:t>. https://www.eapn.eu/news-and-publications/publications/eapn-key-documents/</w:t>
-      </w:r>
+        <w:t xml:space="preserve">. </w:t>
+      </w:r>
+      <w:hyperlink r:id="rId25" w:history="1">
+        <w:r>
+          <w:rPr>
+            <w:rStyle w:val="Hipervnculo"/>
+          </w:rPr>
+          <w:t>https://www.eapn.eu/news-and-publications/publications/eapn-key-documents/</w:t>
+        </w:r>
+      </w:hyperlink>
     </w:p>
     <w:p>
       <w:pPr>
@@ -45707,8 +45327,16 @@
         <w:t>Informe mundial sobre la discapacidad</w:t>
       </w:r>
       <w:r>
-        <w:t>. https://www.who.int/es/publications/i/item/9789241564182</w:t>
-      </w:r>
+        <w:t xml:space="preserve">. </w:t>
+      </w:r>
+      <w:hyperlink r:id="rId26" w:history="1">
+        <w:r>
+          <w:rPr>
+            <w:rStyle w:val="Hipervnculo"/>
+          </w:rPr>
+          <w:t>https://www.who.int/es/publications/i/item/9789241564182</w:t>
+        </w:r>
+      </w:hyperlink>
     </w:p>
     <w:p>
       <w:pPr>
@@ -45745,8 +45373,16 @@
         <w:t>Directiva (UE) 2019/882 del Parlamento Europeo y del Consejo, de 17 de abril de 2019, sobre los requisitos de accesibilidad de los productos y servicios</w:t>
       </w:r>
       <w:r>
-        <w:t>. Diario Oficial de la Unión Europea. https://eur-lex.europa.eu/eli/dir/2019/882/oj</w:t>
-      </w:r>
+        <w:t xml:space="preserve">. Diario Oficial de la Unión Europea. </w:t>
+      </w:r>
+      <w:hyperlink r:id="rId27" w:history="1">
+        <w:r>
+          <w:rPr>
+            <w:rStyle w:val="Hipervnculo"/>
+          </w:rPr>
+          <w:t>https://eur-lex.europa.eu/eli/dir/2019/882/oj</w:t>
+        </w:r>
+      </w:hyperlink>
     </w:p>
     <w:p>
       <w:pPr>
@@ -45758,66 +45394,44 @@
         </w:rPr>
       </w:pPr>
       <w:r>
-        <w:t xml:space="preserve">World Wide Web </w:t>
-      </w:r>
-      <w:proofErr w:type="spellStart"/>
-      <w:r>
-        <w:t>Consortium</w:t>
-      </w:r>
-      <w:proofErr w:type="spellEnd"/>
-      <w:r>
-        <w:t xml:space="preserve">. (2023). </w:t>
+        <w:rPr>
+          <w:lang w:val="en-GB"/>
+        </w:rPr>
+        <w:t xml:space="preserve">World Wide Web Consortium. (2023). </w:t>
       </w:r>
       <w:r>
         <w:rPr>
           <w:i/>
           <w:iCs/>
-        </w:rPr>
-        <w:t xml:space="preserve">Web Content </w:t>
+          <w:lang w:val="en-GB"/>
+        </w:rPr>
+        <w:t>Web Content Accessibility Guidelines (WCAG) 2.2</w:t>
+      </w:r>
+      <w:r>
+        <w:rPr>
+          <w:lang w:val="en-GB"/>
+        </w:rPr>
+        <w:t xml:space="preserve">. </w:t>
+      </w:r>
+      <w:r>
+        <w:t xml:space="preserve">W3C </w:t>
       </w:r>
       <w:proofErr w:type="spellStart"/>
       <w:r>
-        <w:rPr>
-          <w:i/>
-          <w:iCs/>
-        </w:rPr>
-        <w:t>Accessibility</w:t>
+        <w:t>Recommendation</w:t>
       </w:r>
       <w:proofErr w:type="spellEnd"/>
       <w:r>
-        <w:rPr>
-          <w:i/>
-          <w:iCs/>
-        </w:rPr>
-        <w:t xml:space="preserve"> </w:t>
-      </w:r>
-      <w:proofErr w:type="spellStart"/>
-      <w:r>
-        <w:rPr>
-          <w:i/>
-          <w:iCs/>
-        </w:rPr>
-        <w:t>Guidelines</w:t>
-      </w:r>
-      <w:proofErr w:type="spellEnd"/>
-      <w:r>
-        <w:rPr>
-          <w:i/>
-          <w:iCs/>
-        </w:rPr>
-        <w:t xml:space="preserve"> (WCAG) 2.2</w:t>
-      </w:r>
-      <w:r>
-        <w:t xml:space="preserve">. W3C </w:t>
-      </w:r>
-      <w:proofErr w:type="spellStart"/>
-      <w:r>
-        <w:t>Recommendation</w:t>
-      </w:r>
-      <w:proofErr w:type="spellEnd"/>
-      <w:r>
-        <w:t>. https://www.w3.org/TR/WCAG22/</w:t>
-      </w:r>
+        <w:t xml:space="preserve">. </w:t>
+      </w:r>
+      <w:hyperlink r:id="rId28" w:history="1">
+        <w:r>
+          <w:rPr>
+            <w:rStyle w:val="Hipervnculo"/>
+          </w:rPr>
+          <w:t>https://www.w3.org/TR/WCAG22/</w:t>
+        </w:r>
+      </w:hyperlink>
     </w:p>
     <w:p>
       <w:pPr>
@@ -45854,8 +45468,16 @@
         <w:t>Iconicidad y facilidad de aprendizaje de los símbolos pictográficos de ARASAAC</w:t>
       </w:r>
       <w:r>
-        <w:t>. Aula Abierta ARASAAC. https://aulaabierta.arasaac.org/iconocidad-y-facilidad-de-aprendizaje-de-los-simbolos-pictograficos-de-arasaac</w:t>
-      </w:r>
+        <w:t xml:space="preserve">. Aula Abierta ARASAAC. </w:t>
+      </w:r>
+      <w:hyperlink r:id="rId29" w:history="1">
+        <w:r>
+          <w:rPr>
+            <w:rStyle w:val="Hipervnculo"/>
+          </w:rPr>
+          <w:t>https://aulaabierta.arasaac.org/iconocidad-y-facilidad-de-aprendizaje-de-los-simbolos-pictograficos-de-arasaac</w:t>
+        </w:r>
+      </w:hyperlink>
     </w:p>
     <w:p>
       <w:pPr>
@@ -45866,112 +45488,33 @@
           <w14:ligatures w14:val="standardContextual"/>
         </w:rPr>
       </w:pPr>
-      <w:r>
-        <w:t xml:space="preserve">Paolieri, D., y </w:t>
-      </w:r>
       <w:proofErr w:type="spellStart"/>
       <w:r>
+        <w:rPr>
+          <w:lang w:val="en-GB"/>
+        </w:rPr>
+        <w:t>Paolieri</w:t>
+      </w:r>
+      <w:proofErr w:type="spellEnd"/>
+      <w:r>
+        <w:rPr>
+          <w:lang w:val="en-GB"/>
+        </w:rPr>
+        <w:t xml:space="preserve">, D., y </w:t>
+      </w:r>
+      <w:proofErr w:type="spellStart"/>
+      <w:r>
+        <w:rPr>
+          <w:lang w:val="en-GB"/>
+        </w:rPr>
         <w:t>Marful</w:t>
       </w:r>
       <w:proofErr w:type="spellEnd"/>
       <w:r>
-        <w:t xml:space="preserve">, A. (2018). </w:t>
-      </w:r>
-      <w:proofErr w:type="spellStart"/>
-      <w:r>
-        <w:t>Norms</w:t>
-      </w:r>
-      <w:proofErr w:type="spellEnd"/>
-      <w:r>
-        <w:t xml:space="preserve"> </w:t>
-      </w:r>
-      <w:proofErr w:type="spellStart"/>
-      <w:r>
-        <w:t>for</w:t>
-      </w:r>
-      <w:proofErr w:type="spellEnd"/>
-      <w:r>
-        <w:t xml:space="preserve"> </w:t>
-      </w:r>
-      <w:proofErr w:type="spellStart"/>
-      <w:r>
-        <w:t>name</w:t>
-      </w:r>
-      <w:proofErr w:type="spellEnd"/>
-      <w:r>
-        <w:t xml:space="preserve"> </w:t>
-      </w:r>
-      <w:proofErr w:type="spellStart"/>
-      <w:r>
-        <w:t>agreement</w:t>
-      </w:r>
-      <w:proofErr w:type="spellEnd"/>
-      <w:r>
-        <w:t xml:space="preserve">, </w:t>
-      </w:r>
-      <w:proofErr w:type="spellStart"/>
-      <w:r>
-        <w:t>familiarity</w:t>
-      </w:r>
-      <w:proofErr w:type="spellEnd"/>
-      <w:r>
-        <w:t xml:space="preserve">, </w:t>
-      </w:r>
-      <w:proofErr w:type="spellStart"/>
-      <w:r>
-        <w:t>subjective</w:t>
-      </w:r>
-      <w:proofErr w:type="spellEnd"/>
-      <w:r>
-        <w:t xml:space="preserve"> </w:t>
-      </w:r>
-      <w:proofErr w:type="spellStart"/>
-      <w:r>
-        <w:t>frequency</w:t>
-      </w:r>
-      <w:proofErr w:type="spellEnd"/>
-      <w:r>
-        <w:t xml:space="preserve">, and </w:t>
-      </w:r>
-      <w:proofErr w:type="spellStart"/>
-      <w:r>
-        <w:t>imageability</w:t>
-      </w:r>
-      <w:proofErr w:type="spellEnd"/>
-      <w:r>
-        <w:t xml:space="preserve"> </w:t>
-      </w:r>
-      <w:proofErr w:type="spellStart"/>
-      <w:r>
-        <w:t>for</w:t>
-      </w:r>
-      <w:proofErr w:type="spellEnd"/>
-      <w:r>
-        <w:t xml:space="preserve"> 348 </w:t>
-      </w:r>
-      <w:proofErr w:type="spellStart"/>
-      <w:r>
-        <w:t>words</w:t>
-      </w:r>
-      <w:proofErr w:type="spellEnd"/>
-      <w:r>
-        <w:t xml:space="preserve"> in </w:t>
-      </w:r>
-      <w:proofErr w:type="spellStart"/>
-      <w:r>
-        <w:t>European</w:t>
-      </w:r>
-      <w:proofErr w:type="spellEnd"/>
-      <w:r>
-        <w:t xml:space="preserve"> Spanish and </w:t>
-      </w:r>
-      <w:proofErr w:type="spellStart"/>
-      <w:r>
-        <w:t>Romanian</w:t>
-      </w:r>
-      <w:proofErr w:type="spellEnd"/>
-      <w:r>
-        <w:t xml:space="preserve">. </w:t>
+        <w:rPr>
+          <w:lang w:val="en-GB"/>
+        </w:rPr>
+        <w:t xml:space="preserve">, A. (2018). Norms for name agreement, familiarity, subjective frequency, and imageability for 348 words in European Spanish and Romanian. </w:t>
       </w:r>
       <w:proofErr w:type="spellStart"/>
       <w:r>
@@ -45999,8 +45542,16 @@
       </w:r>
       <w:proofErr w:type="spellEnd"/>
       <w:r>
-        <w:t>, 9, 2538. https://doi.org/10.3389/fpsyg.2018.02538</w:t>
-      </w:r>
+        <w:t xml:space="preserve">, 9, 2538. </w:t>
+      </w:r>
+      <w:hyperlink r:id="rId30" w:history="1">
+        <w:r>
+          <w:rPr>
+            <w:rStyle w:val="Hipervnculo"/>
+          </w:rPr>
+          <w:t>https://doi.org/10.3389/fpsyg.2018.02538</w:t>
+        </w:r>
+      </w:hyperlink>
     </w:p>
     <w:p>
       <w:pPr>
@@ -46056,8 +45607,16 @@
       </w:r>
       <w:proofErr w:type="spellEnd"/>
       <w:r>
-        <w:t xml:space="preserve"> [Plataforma de software]. https://timeoverflow.org/</w:t>
-      </w:r>
+        <w:t xml:space="preserve"> [Plataforma de software]. </w:t>
+      </w:r>
+      <w:hyperlink r:id="rId31" w:history="1">
+        <w:r>
+          <w:rPr>
+            <w:rStyle w:val="Hipervnculo"/>
+          </w:rPr>
+          <w:t>https://timeoverflow.org/</w:t>
+        </w:r>
+      </w:hyperlink>
     </w:p>
     <w:p>
       <w:pPr>
@@ -46079,8 +45638,175 @@
         <w:t>Portal Aragonés de la Comunicación Aumentativa y Alternativa (ARASAAC)</w:t>
       </w:r>
       <w:r>
-        <w:t>. Centro Aragonés de la Comunicación Aumentativa y Alternativa. https://arasaac.org/</w:t>
-      </w:r>
+        <w:t xml:space="preserve">. Centro Aragonés de la Comunicación Aumentativa y Alternativa. </w:t>
+      </w:r>
+      <w:hyperlink r:id="rId32" w:history="1">
+        <w:r>
+          <w:rPr>
+            <w:rStyle w:val="Hipervnculo"/>
+          </w:rPr>
+          <w:t>https://arasaac.org/</w:t>
+        </w:r>
+      </w:hyperlink>
+    </w:p>
+    <w:p>
+      <w:pPr>
+        <w:spacing w:before="0" w:after="0"/>
+        <w:rPr>
+          <w:kern w:val="2"/>
+          <w:lang w:val="en-GB"/>
+          <w14:ligatures w14:val="standardContextual"/>
+        </w:rPr>
+      </w:pPr>
+      <w:r>
+        <w:rPr>
+          <w:lang w:val="en-GB"/>
+        </w:rPr>
+        <w:t>Google LLC. (</w:t>
+      </w:r>
+      <w:proofErr w:type="spellStart"/>
+      <w:r>
+        <w:rPr>
+          <w:lang w:val="en-GB"/>
+        </w:rPr>
+        <w:t>s.f.</w:t>
+      </w:r>
+      <w:proofErr w:type="spellEnd"/>
+      <w:r>
+        <w:rPr>
+          <w:lang w:val="en-GB"/>
+        </w:rPr>
+        <w:t xml:space="preserve">-a). </w:t>
+      </w:r>
+      <w:r>
+        <w:rPr>
+          <w:i/>
+          <w:iCs/>
+          <w:lang w:val="en-GB"/>
+        </w:rPr>
+        <w:t>Guide to app architecture</w:t>
+      </w:r>
+      <w:r>
+        <w:rPr>
+          <w:lang w:val="en-GB"/>
+        </w:rPr>
+        <w:t xml:space="preserve">. Android Developers. </w:t>
+      </w:r>
+      <w:hyperlink r:id="rId33" w:history="1">
+        <w:r>
+          <w:rPr>
+            <w:rStyle w:val="Hipervnculo"/>
+            <w:lang w:val="en-GB"/>
+          </w:rPr>
+          <w:t>https://developer.android.com/topic/architecture</w:t>
+        </w:r>
+      </w:hyperlink>
+    </w:p>
+    <w:p>
+      <w:pPr>
+        <w:spacing w:before="0" w:after="0"/>
+        <w:rPr>
+          <w:kern w:val="2"/>
+          <w:lang w:val="en-GB"/>
+          <w14:ligatures w14:val="standardContextual"/>
+        </w:rPr>
+      </w:pPr>
+      <w:r>
+        <w:rPr>
+          <w:lang w:val="en-GB"/>
+        </w:rPr>
+        <w:t>Google LLC. (</w:t>
+      </w:r>
+      <w:proofErr w:type="spellStart"/>
+      <w:r>
+        <w:rPr>
+          <w:lang w:val="en-GB"/>
+        </w:rPr>
+        <w:t>s.f.</w:t>
+      </w:r>
+      <w:proofErr w:type="spellEnd"/>
+      <w:r>
+        <w:rPr>
+          <w:lang w:val="en-GB"/>
+        </w:rPr>
+        <w:t xml:space="preserve">-b). </w:t>
+      </w:r>
+      <w:r>
+        <w:rPr>
+          <w:i/>
+          <w:iCs/>
+          <w:lang w:val="en-GB"/>
+        </w:rPr>
+        <w:t>Material Design 3</w:t>
+      </w:r>
+      <w:r>
+        <w:rPr>
+          <w:lang w:val="en-GB"/>
+        </w:rPr>
+        <w:t xml:space="preserve">. </w:t>
+      </w:r>
+      <w:hyperlink r:id="rId34" w:history="1">
+        <w:r>
+          <w:rPr>
+            <w:rStyle w:val="Hipervnculo"/>
+            <w:lang w:val="en-GB"/>
+          </w:rPr>
+          <w:t>https://m3.material.io/</w:t>
+        </w:r>
+      </w:hyperlink>
+    </w:p>
+    <w:p>
+      <w:pPr>
+        <w:spacing w:before="0" w:after="0"/>
+        <w:rPr>
+          <w:kern w:val="2"/>
+          <w:lang w:val="en-GB"/>
+          <w14:ligatures w14:val="standardContextual"/>
+        </w:rPr>
+      </w:pPr>
+      <w:r>
+        <w:rPr>
+          <w:lang w:val="en-GB"/>
+        </w:rPr>
+        <w:t>Google LLC. (</w:t>
+      </w:r>
+      <w:proofErr w:type="spellStart"/>
+      <w:r>
+        <w:rPr>
+          <w:lang w:val="en-GB"/>
+        </w:rPr>
+        <w:t>s.f.</w:t>
+      </w:r>
+      <w:proofErr w:type="spellEnd"/>
+      <w:r>
+        <w:rPr>
+          <w:lang w:val="en-GB"/>
+        </w:rPr>
+        <w:t xml:space="preserve">-c). </w:t>
+      </w:r>
+      <w:r>
+        <w:rPr>
+          <w:i/>
+          <w:iCs/>
+          <w:lang w:val="en-GB"/>
+        </w:rPr>
+        <w:t>Room persistence library</w:t>
+      </w:r>
+      <w:r>
+        <w:rPr>
+          <w:lang w:val="en-GB"/>
+        </w:rPr>
+        <w:t xml:space="preserve">. Android Developers. </w:t>
+      </w:r>
+      <w:hyperlink r:id="rId35" w:history="1">
+        <w:r>
+          <w:rPr>
+            <w:rStyle w:val="Hipervnculo"/>
+            <w:lang w:val="en-GB"/>
+          </w:rPr>
+          <w:t>https://developer.android.com/training/data-storage/room</w:t>
+        </w:r>
+      </w:hyperlink>
     </w:p>
     <w:p>
       <w:pPr>
@@ -46092,67 +45818,77 @@
         </w:rPr>
       </w:pPr>
       <w:r>
-        <w:t xml:space="preserve">Google LLC. (s.f.-a). </w:t>
-      </w:r>
+        <w:t xml:space="preserve">Jahoda, P. (2020). </w:t>
+      </w:r>
+      <w:proofErr w:type="spellStart"/>
       <w:r>
         <w:rPr>
           <w:i/>
           <w:iCs/>
         </w:rPr>
-        <w:t xml:space="preserve">Guide </w:t>
-      </w:r>
+        <w:t>MPAndroidChart</w:t>
+      </w:r>
+      <w:proofErr w:type="spellEnd"/>
+      <w:r>
+        <w:t xml:space="preserve"> (Versión 3.1.0) [Biblioteca de software]. GitHub</w:t>
+      </w:r>
+      <w:hyperlink r:id="rId36" w:history="1">
+        <w:r>
+          <w:rPr>
+            <w:rStyle w:val="Hipervnculo"/>
+          </w:rPr>
+          <w:t>. https://github.com/PhilJay/MPAndroidChart</w:t>
+        </w:r>
+      </w:hyperlink>
+    </w:p>
+    <w:p>
+      <w:pPr>
+        <w:spacing w:before="0" w:after="0"/>
+        <w:rPr>
+          <w:kern w:val="2"/>
+          <w:lang w:val="en-GB"/>
+          <w14:ligatures w14:val="standardContextual"/>
+        </w:rPr>
+      </w:pPr>
       <w:proofErr w:type="spellStart"/>
+      <w:r>
+        <w:t>JetBrains</w:t>
+      </w:r>
+      <w:proofErr w:type="spellEnd"/>
+      <w:r>
+        <w:t xml:space="preserve"> </w:t>
+      </w:r>
+      <w:proofErr w:type="spellStart"/>
+      <w:r>
+        <w:t>s.r.o</w:t>
+      </w:r>
+      <w:proofErr w:type="spellEnd"/>
+      <w:r>
+        <w:t xml:space="preserve">. (s.f.). </w:t>
+      </w:r>
       <w:r>
         <w:rPr>
           <w:i/>
           <w:iCs/>
-        </w:rPr>
-        <w:t>to</w:t>
-      </w:r>
-      <w:proofErr w:type="spellEnd"/>
-      <w:r>
-        <w:rPr>
-          <w:i/>
-          <w:iCs/>
-        </w:rPr>
-        <w:t xml:space="preserve"> </w:t>
-      </w:r>
-      <w:proofErr w:type="gramStart"/>
-      <w:r>
-        <w:rPr>
-          <w:i/>
-          <w:iCs/>
-        </w:rPr>
-        <w:t>app</w:t>
-      </w:r>
-      <w:proofErr w:type="gramEnd"/>
-      <w:r>
-        <w:rPr>
-          <w:i/>
-          <w:iCs/>
-        </w:rPr>
-        <w:t xml:space="preserve"> </w:t>
-      </w:r>
-      <w:proofErr w:type="spellStart"/>
-      <w:r>
-        <w:rPr>
-          <w:i/>
-          <w:iCs/>
-        </w:rPr>
-        <w:t>architecture</w:t>
-      </w:r>
-      <w:proofErr w:type="spellEnd"/>
-      <w:r>
-        <w:t xml:space="preserve">. Android </w:t>
-      </w:r>
-      <w:proofErr w:type="spellStart"/>
-      <w:r>
-        <w:t>Developers</w:t>
-      </w:r>
-      <w:proofErr w:type="spellEnd"/>
-      <w:r>
-        <w:t>. https://developer.android.com/topic/architecture</w:t>
-      </w:r>
+          <w:lang w:val="en-GB"/>
+        </w:rPr>
+        <w:t>Kotlin Programming Language</w:t>
+      </w:r>
+      <w:r>
+        <w:rPr>
+          <w:lang w:val="en-GB"/>
+        </w:rPr>
+        <w:t xml:space="preserve">. </w:t>
+      </w:r>
+      <w:hyperlink r:id="rId37" w:history="1">
+        <w:r>
+          <w:rPr>
+            <w:rStyle w:val="Hipervnculo"/>
+            <w:lang w:val="en-GB"/>
+          </w:rPr>
+          <w:t>https://kotlinlang.org/</w:t>
+        </w:r>
+      </w:hyperlink>
     </w:p>
     <w:p>
       <w:pPr>
@@ -46164,90 +45900,238 @@
         </w:rPr>
       </w:pPr>
       <w:r>
-        <w:t xml:space="preserve">Google LLC. (s.f.-b). </w:t>
+        <w:t xml:space="preserve">Palao, S. (s.f.). </w:t>
       </w:r>
       <w:r>
         <w:rPr>
           <w:i/>
           <w:iCs/>
         </w:rPr>
-        <w:t xml:space="preserve">Material </w:t>
-      </w:r>
-      <w:proofErr w:type="spellStart"/>
-      <w:r>
-        <w:rPr>
-          <w:i/>
-          <w:iCs/>
-        </w:rPr>
-        <w:t>Design</w:t>
-      </w:r>
-      <w:proofErr w:type="spellEnd"/>
-      <w:r>
-        <w:rPr>
-          <w:i/>
-          <w:iCs/>
-        </w:rPr>
-        <w:t xml:space="preserve"> 3</w:t>
-      </w:r>
-      <w:r>
-        <w:t>. https://m3.material.io/</w:t>
-      </w:r>
+        <w:t>Catálogo de pictogramas ARASAAC</w:t>
+      </w:r>
+      <w:r>
+        <w:t xml:space="preserve">. Centro Aragonés de la Comunicación Aumentativa y Alternativa y Gobierno de Aragón. </w:t>
+      </w:r>
+      <w:hyperlink r:id="rId38" w:history="1">
+        <w:r>
+          <w:rPr>
+            <w:rStyle w:val="Hipervnculo"/>
+          </w:rPr>
+          <w:t>https://arasaac.org/pictograms/search</w:t>
+        </w:r>
+      </w:hyperlink>
     </w:p>
     <w:p>
       <w:pPr>
-        <w:spacing w:before="0" w:after="0"/>
+        <w:pStyle w:val="Ttulo3"/>
         <w:rPr>
           <w:kern w:val="2"/>
           <w:lang w:val="es-ES"/>
           <w14:ligatures w14:val="standardContextual"/>
         </w:rPr>
       </w:pPr>
-      <w:r>
-        <w:t xml:space="preserve">Google LLC. (s.f.-c). </w:t>
+      <w:bookmarkStart w:id="78" w:name="_Toc227493759"/>
+      <w:r>
+        <w:t>Plataformas competidoras y contexto del sector</w:t>
+      </w:r>
+      <w:bookmarkEnd w:id="78"/>
+    </w:p>
+    <w:p>
+      <w:pPr>
+        <w:spacing w:before="0" w:after="0"/>
+        <w:rPr>
+          <w:kern w:val="2"/>
+          <w:lang w:val="en-GB"/>
+          <w14:ligatures w14:val="standardContextual"/>
+        </w:rPr>
+      </w:pPr>
+      <w:r>
+        <w:rPr>
+          <w:lang w:val="en-GB"/>
+        </w:rPr>
+        <w:t>Good Hood GmbH. (</w:t>
+      </w:r>
+      <w:proofErr w:type="spellStart"/>
+      <w:r>
+        <w:rPr>
+          <w:lang w:val="en-GB"/>
+        </w:rPr>
+        <w:t>s.f.</w:t>
+      </w:r>
+      <w:proofErr w:type="spellEnd"/>
+      <w:r>
+        <w:rPr>
+          <w:lang w:val="en-GB"/>
+        </w:rPr>
+        <w:t xml:space="preserve">). </w:t>
       </w:r>
       <w:r>
         <w:rPr>
           <w:i/>
           <w:iCs/>
-        </w:rPr>
-        <w:t xml:space="preserve">Room </w:t>
+          <w:lang w:val="en-GB"/>
+        </w:rPr>
+        <w:t xml:space="preserve">Nebenan.de: Die </w:t>
       </w:r>
       <w:proofErr w:type="spellStart"/>
       <w:r>
         <w:rPr>
           <w:i/>
           <w:iCs/>
-        </w:rPr>
-        <w:t>persistence</w:t>
+          <w:lang w:val="en-GB"/>
+        </w:rPr>
+        <w:t>Nachbarschaftsplattform</w:t>
       </w:r>
       <w:proofErr w:type="spellEnd"/>
+      <w:r>
+        <w:rPr>
+          <w:lang w:val="en-GB"/>
+        </w:rPr>
+        <w:t xml:space="preserve">. </w:t>
+      </w:r>
+      <w:hyperlink r:id="rId39" w:history="1">
+        <w:r>
+          <w:rPr>
+            <w:rStyle w:val="Hipervnculo"/>
+            <w:lang w:val="en-GB"/>
+          </w:rPr>
+          <w:t>https://nebenan.de/</w:t>
+        </w:r>
+      </w:hyperlink>
+    </w:p>
+    <w:p>
+      <w:pPr>
+        <w:spacing w:before="0" w:after="0"/>
+        <w:rPr>
+          <w:kern w:val="2"/>
+          <w:lang w:val="en-GB"/>
+          <w14:ligatures w14:val="standardContextual"/>
+        </w:rPr>
+      </w:pPr>
+      <w:proofErr w:type="spellStart"/>
+      <w:r>
+        <w:rPr>
+          <w:lang w:val="en-GB"/>
+        </w:rPr>
+        <w:t>Nextdoor</w:t>
+      </w:r>
+      <w:proofErr w:type="spellEnd"/>
+      <w:r>
+        <w:rPr>
+          <w:lang w:val="en-GB"/>
+        </w:rPr>
+        <w:t xml:space="preserve"> Holdings, Inc. (</w:t>
+      </w:r>
+      <w:proofErr w:type="spellStart"/>
+      <w:r>
+        <w:rPr>
+          <w:lang w:val="en-GB"/>
+        </w:rPr>
+        <w:t>s.f.</w:t>
+      </w:r>
+      <w:proofErr w:type="spellEnd"/>
+      <w:r>
+        <w:rPr>
+          <w:lang w:val="en-GB"/>
+        </w:rPr>
+        <w:t xml:space="preserve">). </w:t>
+      </w:r>
+      <w:proofErr w:type="spellStart"/>
       <w:r>
         <w:rPr>
           <w:i/>
           <w:iCs/>
-        </w:rPr>
-        <w:t xml:space="preserve"> </w:t>
+          <w:lang w:val="en-GB"/>
+        </w:rPr>
+        <w:t>Nextdoor</w:t>
+      </w:r>
+      <w:proofErr w:type="spellEnd"/>
+      <w:r>
+        <w:rPr>
+          <w:lang w:val="en-GB"/>
+        </w:rPr>
+        <w:t xml:space="preserve"> [Plataforma digital]. </w:t>
+      </w:r>
+      <w:hyperlink r:id="rId40" w:history="1">
+        <w:r>
+          <w:rPr>
+            <w:rStyle w:val="Hipervnculo"/>
+            <w:lang w:val="en-GB"/>
+          </w:rPr>
+          <w:t>https://nextdoor.es/</w:t>
+        </w:r>
+      </w:hyperlink>
+    </w:p>
+    <w:p>
+      <w:pPr>
+        <w:spacing w:before="0" w:after="0"/>
+        <w:rPr>
+          <w:kern w:val="2"/>
+          <w:lang w:val="en-GB"/>
+          <w14:ligatures w14:val="standardContextual"/>
+        </w:rPr>
+      </w:pPr>
+      <w:proofErr w:type="spellStart"/>
+      <w:r>
+        <w:rPr>
+          <w:lang w:val="en-GB"/>
+        </w:rPr>
+        <w:t>TimeRepublik</w:t>
+      </w:r>
+      <w:proofErr w:type="spellEnd"/>
+      <w:r>
+        <w:rPr>
+          <w:lang w:val="en-GB"/>
+        </w:rPr>
+        <w:t>. (</w:t>
+      </w:r>
+      <w:proofErr w:type="spellStart"/>
+      <w:r>
+        <w:rPr>
+          <w:lang w:val="en-GB"/>
+        </w:rPr>
+        <w:t>s.f.</w:t>
+      </w:r>
+      <w:proofErr w:type="spellEnd"/>
+      <w:r>
+        <w:rPr>
+          <w:lang w:val="en-GB"/>
+        </w:rPr>
+        <w:t xml:space="preserve">). </w:t>
       </w:r>
       <w:proofErr w:type="spellStart"/>
       <w:r>
         <w:rPr>
           <w:i/>
           <w:iCs/>
-        </w:rPr>
-        <w:t>library</w:t>
+          <w:lang w:val="en-GB"/>
+        </w:rPr>
+        <w:t>TimeRepublik</w:t>
       </w:r>
       <w:proofErr w:type="spellEnd"/>
       <w:r>
-        <w:t xml:space="preserve">. Android </w:t>
-      </w:r>
-      <w:proofErr w:type="spellStart"/>
-      <w:r>
-        <w:t>Developers</w:t>
-      </w:r>
-      <w:proofErr w:type="spellEnd"/>
-      <w:r>
-        <w:t>. https://developer.android.com/training/data-storage/room</w:t>
-      </w:r>
+        <w:rPr>
+          <w:i/>
+          <w:iCs/>
+          <w:lang w:val="en-GB"/>
+        </w:rPr>
+        <w:t>: The first economy built on the fairness of time</w:t>
+      </w:r>
+      <w:r>
+        <w:rPr>
+          <w:lang w:val="en-GB"/>
+        </w:rPr>
+        <w:t xml:space="preserve">. </w:t>
+      </w:r>
+      <w:hyperlink r:id="rId41" w:history="1">
+        <w:r>
+          <w:rPr>
+            <w:rStyle w:val="Hipervnculo"/>
+            <w:lang w:val="en-GB"/>
+          </w:rPr>
+          <w:t>https://timerepublik.com/</w:t>
+        </w:r>
+      </w:hyperlink>
     </w:p>
     <w:p>
       <w:pPr>
@@ -46259,389 +46143,48 @@
         </w:rPr>
       </w:pPr>
       <w:r>
-        <w:t xml:space="preserve">Jahoda, P. (2020). </w:t>
-      </w:r>
-      <w:proofErr w:type="spellStart"/>
+        <w:t xml:space="preserve">Zona Retiro. (2023, 27 de septiembre). </w:t>
+      </w:r>
       <w:r>
         <w:rPr>
           <w:i/>
           <w:iCs/>
         </w:rPr>
-        <w:t>MPAndroidChart</w:t>
-      </w:r>
-      <w:proofErr w:type="spellEnd"/>
-      <w:r>
-        <w:t xml:space="preserve"> (Versión 3.1.0) [Biblioteca de software]. GitHub. https://github.com/PhilJay/MPAndroidChart</w:t>
-      </w:r>
+        <w:t>Cierra '¿Tienes sal?': La plataforma vecinal dice adiós por falta de presupuesto</w:t>
+      </w:r>
+      <w:r>
+        <w:t xml:space="preserve">. </w:t>
+      </w:r>
+      <w:hyperlink r:id="rId42" w:history="1">
+        <w:r>
+          <w:rPr>
+            <w:rStyle w:val="Hipervnculo"/>
+          </w:rPr>
+          <w:t>https://zonaretiro.com/ciudadanos/cierr</w:t>
+        </w:r>
+        <w:r>
+          <w:rPr>
+            <w:rStyle w:val="Hipervnculo"/>
+          </w:rPr>
+          <w:t>a</w:t>
+        </w:r>
+        <w:r>
+          <w:rPr>
+            <w:rStyle w:val="Hipervnculo"/>
+          </w:rPr>
+          <w:t>-tienes-sal/</w:t>
+        </w:r>
+      </w:hyperlink>
     </w:p>
     <w:p>
       <w:pPr>
-        <w:spacing w:before="0" w:after="0"/>
+        <w:pStyle w:val="Ttulo3"/>
         <w:rPr>
           <w:kern w:val="2"/>
           <w:lang w:val="es-ES"/>
           <w14:ligatures w14:val="standardContextual"/>
         </w:rPr>
       </w:pPr>
-      <w:proofErr w:type="spellStart"/>
-      <w:r>
-        <w:t>JetBrains</w:t>
-      </w:r>
-      <w:proofErr w:type="spellEnd"/>
-      <w:r>
-        <w:t xml:space="preserve"> </w:t>
-      </w:r>
-      <w:proofErr w:type="spellStart"/>
-      <w:r>
-        <w:t>s.r.o</w:t>
-      </w:r>
-      <w:proofErr w:type="spellEnd"/>
-      <w:r>
-        <w:t xml:space="preserve">. (s.f.). </w:t>
-      </w:r>
-      <w:proofErr w:type="spellStart"/>
-      <w:r>
-        <w:rPr>
-          <w:i/>
-          <w:iCs/>
-        </w:rPr>
-        <w:t>Kotlin</w:t>
-      </w:r>
-      <w:proofErr w:type="spellEnd"/>
-      <w:r>
-        <w:rPr>
-          <w:i/>
-          <w:iCs/>
-        </w:rPr>
-        <w:t xml:space="preserve"> </w:t>
-      </w:r>
-      <w:proofErr w:type="spellStart"/>
-      <w:r>
-        <w:rPr>
-          <w:i/>
-          <w:iCs/>
-        </w:rPr>
-        <w:t>Programming</w:t>
-      </w:r>
-      <w:proofErr w:type="spellEnd"/>
-      <w:r>
-        <w:rPr>
-          <w:i/>
-          <w:iCs/>
-        </w:rPr>
-        <w:t xml:space="preserve"> </w:t>
-      </w:r>
-      <w:proofErr w:type="spellStart"/>
-      <w:r>
-        <w:rPr>
-          <w:i/>
-          <w:iCs/>
-        </w:rPr>
-        <w:t>Language</w:t>
-      </w:r>
-      <w:proofErr w:type="spellEnd"/>
-      <w:r>
-        <w:t>. https://kotlinlang.org/</w:t>
-      </w:r>
-    </w:p>
-    <w:p>
-      <w:pPr>
-        <w:spacing w:before="0" w:after="0"/>
-        <w:rPr>
-          <w:kern w:val="2"/>
-          <w:lang w:val="es-ES"/>
-          <w14:ligatures w14:val="standardContextual"/>
-        </w:rPr>
-      </w:pPr>
-      <w:r>
-        <w:t xml:space="preserve">Palao, S. (s.f.). </w:t>
-      </w:r>
-      <w:r>
-        <w:rPr>
-          <w:i/>
-          <w:iCs/>
-        </w:rPr>
-        <w:t>Catálogo de pictogramas ARASAAC</w:t>
-      </w:r>
-      <w:r>
-        <w:t>. Centro Aragonés de la Comunicación Aumentativa y Alternativa y Gobierno de Aragón. https://arasaac.org/pictograms/search</w:t>
-      </w:r>
-    </w:p>
-    <w:p>
-      <w:pPr>
-        <w:pStyle w:val="Ttulo3"/>
-        <w:rPr>
-          <w:kern w:val="2"/>
-          <w:lang w:val="es-ES"/>
-          <w14:ligatures w14:val="standardContextual"/>
-        </w:rPr>
-      </w:pPr>
-      <w:bookmarkStart w:id="78" w:name="_Toc227493759"/>
-      <w:r>
-        <w:t>Plataformas competidoras y contexto del sector</w:t>
-      </w:r>
-      <w:bookmarkEnd w:id="78"/>
-    </w:p>
-    <w:p>
-      <w:pPr>
-        <w:spacing w:before="0" w:after="0"/>
-        <w:rPr>
-          <w:kern w:val="2"/>
-          <w:lang w:val="es-ES"/>
-          <w14:ligatures w14:val="standardContextual"/>
-        </w:rPr>
-      </w:pPr>
-      <w:r>
-        <w:t xml:space="preserve">Good Hood </w:t>
-      </w:r>
-      <w:proofErr w:type="spellStart"/>
-      <w:r>
-        <w:t>GmbH</w:t>
-      </w:r>
-      <w:proofErr w:type="spellEnd"/>
-      <w:r>
-        <w:t xml:space="preserve">. (s.f.). </w:t>
-      </w:r>
-      <w:proofErr w:type="spellStart"/>
-      <w:r>
-        <w:rPr>
-          <w:i/>
-          <w:iCs/>
-        </w:rPr>
-        <w:t>Nebenan.de</w:t>
-      </w:r>
-      <w:proofErr w:type="spellEnd"/>
-      <w:r>
-        <w:rPr>
-          <w:i/>
-          <w:iCs/>
-        </w:rPr>
-        <w:t xml:space="preserve">: Die </w:t>
-      </w:r>
-      <w:proofErr w:type="spellStart"/>
-      <w:r>
-        <w:rPr>
-          <w:i/>
-          <w:iCs/>
-        </w:rPr>
-        <w:t>Nachbarschaftsplattform</w:t>
-      </w:r>
-      <w:proofErr w:type="spellEnd"/>
-      <w:r>
-        <w:t>. https://nebenan.de/</w:t>
-      </w:r>
-    </w:p>
-    <w:p>
-      <w:pPr>
-        <w:spacing w:before="0" w:after="0"/>
-        <w:rPr>
-          <w:kern w:val="2"/>
-          <w:lang w:val="es-ES"/>
-          <w14:ligatures w14:val="standardContextual"/>
-        </w:rPr>
-      </w:pPr>
-      <w:proofErr w:type="spellStart"/>
-      <w:r>
-        <w:t>Nextdoor</w:t>
-      </w:r>
-      <w:proofErr w:type="spellEnd"/>
-      <w:r>
-        <w:t xml:space="preserve"> Holdings, Inc. (s.f.). </w:t>
-      </w:r>
-      <w:proofErr w:type="spellStart"/>
-      <w:r>
-        <w:rPr>
-          <w:i/>
-          <w:iCs/>
-        </w:rPr>
-        <w:t>Nextdoor</w:t>
-      </w:r>
-      <w:proofErr w:type="spellEnd"/>
-      <w:r>
-        <w:t xml:space="preserve"> [Plataforma digital]. https://nextdoor.es/</w:t>
-      </w:r>
-    </w:p>
-    <w:p>
-      <w:pPr>
-        <w:spacing w:before="0" w:after="0"/>
-        <w:rPr>
-          <w:kern w:val="2"/>
-          <w:lang w:val="es-ES"/>
-          <w14:ligatures w14:val="standardContextual"/>
-        </w:rPr>
-      </w:pPr>
-      <w:proofErr w:type="spellStart"/>
-      <w:r>
-        <w:t>TimeRepublik</w:t>
-      </w:r>
-      <w:proofErr w:type="spellEnd"/>
-      <w:r>
-        <w:t xml:space="preserve">. (s.f.). </w:t>
-      </w:r>
-      <w:proofErr w:type="spellStart"/>
-      <w:r>
-        <w:rPr>
-          <w:i/>
-          <w:iCs/>
-        </w:rPr>
-        <w:t>TimeRepublik</w:t>
-      </w:r>
-      <w:proofErr w:type="spellEnd"/>
-      <w:r>
-        <w:rPr>
-          <w:i/>
-          <w:iCs/>
-        </w:rPr>
-        <w:t xml:space="preserve">: The </w:t>
-      </w:r>
-      <w:proofErr w:type="spellStart"/>
-      <w:r>
-        <w:rPr>
-          <w:i/>
-          <w:iCs/>
-        </w:rPr>
-        <w:t>first</w:t>
-      </w:r>
-      <w:proofErr w:type="spellEnd"/>
-      <w:r>
-        <w:rPr>
-          <w:i/>
-          <w:iCs/>
-        </w:rPr>
-        <w:t xml:space="preserve"> </w:t>
-      </w:r>
-      <w:proofErr w:type="spellStart"/>
-      <w:r>
-        <w:rPr>
-          <w:i/>
-          <w:iCs/>
-        </w:rPr>
-        <w:t>economy</w:t>
-      </w:r>
-      <w:proofErr w:type="spellEnd"/>
-      <w:r>
-        <w:rPr>
-          <w:i/>
-          <w:iCs/>
-        </w:rPr>
-        <w:t xml:space="preserve"> </w:t>
-      </w:r>
-      <w:proofErr w:type="spellStart"/>
-      <w:r>
-        <w:rPr>
-          <w:i/>
-          <w:iCs/>
-        </w:rPr>
-        <w:t>built</w:t>
-      </w:r>
-      <w:proofErr w:type="spellEnd"/>
-      <w:r>
-        <w:rPr>
-          <w:i/>
-          <w:iCs/>
-        </w:rPr>
-        <w:t xml:space="preserve"> </w:t>
-      </w:r>
-      <w:proofErr w:type="spellStart"/>
-      <w:r>
-        <w:rPr>
-          <w:i/>
-          <w:iCs/>
-        </w:rPr>
-        <w:t>on</w:t>
-      </w:r>
-      <w:proofErr w:type="spellEnd"/>
-      <w:r>
-        <w:rPr>
-          <w:i/>
-          <w:iCs/>
-        </w:rPr>
-        <w:t xml:space="preserve"> </w:t>
-      </w:r>
-      <w:proofErr w:type="spellStart"/>
-      <w:r>
-        <w:rPr>
-          <w:i/>
-          <w:iCs/>
-        </w:rPr>
-        <w:t>the</w:t>
-      </w:r>
-      <w:proofErr w:type="spellEnd"/>
-      <w:r>
-        <w:rPr>
-          <w:i/>
-          <w:iCs/>
-        </w:rPr>
-        <w:t xml:space="preserve"> </w:t>
-      </w:r>
-      <w:proofErr w:type="spellStart"/>
-      <w:r>
-        <w:rPr>
-          <w:i/>
-          <w:iCs/>
-        </w:rPr>
-        <w:t>fairness</w:t>
-      </w:r>
-      <w:proofErr w:type="spellEnd"/>
-      <w:r>
-        <w:rPr>
-          <w:i/>
-          <w:iCs/>
-        </w:rPr>
-        <w:t xml:space="preserve"> </w:t>
-      </w:r>
-      <w:proofErr w:type="spellStart"/>
-      <w:r>
-        <w:rPr>
-          <w:i/>
-          <w:iCs/>
-        </w:rPr>
-        <w:t>of</w:t>
-      </w:r>
-      <w:proofErr w:type="spellEnd"/>
-      <w:r>
-        <w:rPr>
-          <w:i/>
-          <w:iCs/>
-        </w:rPr>
-        <w:t xml:space="preserve"> time</w:t>
-      </w:r>
-      <w:r>
-        <w:t>. https://timerepublik.com/</w:t>
-      </w:r>
-    </w:p>
-    <w:p>
-      <w:pPr>
-        <w:spacing w:before="0" w:after="0"/>
-        <w:rPr>
-          <w:kern w:val="2"/>
-          <w:lang w:val="es-ES"/>
-          <w14:ligatures w14:val="standardContextual"/>
-        </w:rPr>
-      </w:pPr>
-      <w:r>
-        <w:t xml:space="preserve">Zona Retiro. (2023, 27 de septiembre). </w:t>
-      </w:r>
-      <w:r>
-        <w:rPr>
-          <w:i/>
-          <w:iCs/>
-        </w:rPr>
-        <w:t>Cierra '¿Tienes sal?': La plataforma vecinal dice adiós por falta de presupuesto</w:t>
-      </w:r>
-      <w:r>
-        <w:t>. https://zonaretiro.com/ciudadanos/cierra-tienes-sal/</w:t>
-      </w:r>
-    </w:p>
-    <w:p>
-      <w:pPr>
-        <w:pStyle w:val="Ttulo3"/>
-        <w:rPr>
-          <w:kern w:val="2"/>
-          <w:lang w:val="es-ES"/>
-          <w14:ligatures w14:val="standardContextual"/>
-        </w:rPr>
-      </w:pPr>
       <w:bookmarkStart w:id="79" w:name="_Toc227493760"/>
       <w:r>
         <w:t>Contexto socioeconómico y aislamiento urbano</w:t>
@@ -46663,8 +46206,16 @@
         <w:t>Aislamiento social en las grandes ciudades: cómo lo están superando las comunidades locales</w:t>
       </w:r>
       <w:r>
-        <w:t>. https://www.liberaldecastilla.com/aislamiento-social-en-las-grandes-ciudades-como-lo-estan-superando-las-comunidades-locales</w:t>
-      </w:r>
+        <w:t xml:space="preserve">. </w:t>
+      </w:r>
+      <w:hyperlink r:id="rId43" w:history="1">
+        <w:r>
+          <w:rPr>
+            <w:rStyle w:val="Hipervnculo"/>
+          </w:rPr>
+          <w:t>https://www.liberaldecastilla.com/aislamiento-social-en-las-grandes-ciudades-como-lo-estan-superando-las-comunidades-locales</w:t>
+        </w:r>
+      </w:hyperlink>
     </w:p>
     <w:p/>
     <w:p>
@@ -46713,7 +46264,6 @@
       </w:pPr>
       <w:bookmarkStart w:id="82" w:name="_Toc227493763"/>
       <w:r>
-        <w:lastRenderedPageBreak/>
         <w:t>Manual de Usuario</w:t>
       </w:r>
       <w:bookmarkEnd w:id="82"/>
@@ -46792,7 +46342,7 @@
                     <pic:cNvPicPr preferRelativeResize="0"/>
                   </pic:nvPicPr>
                   <pic:blipFill>
-                    <a:blip r:embed="rId8"/>
+                    <a:blip r:embed="rId9"/>
                     <a:srcRect/>
                     <a:stretch>
                       <a:fillRect/>
@@ -46816,10 +46366,10 @@
       </w:r>
     </w:p>
     <w:sectPr>
-      <w:headerReference w:type="default" r:id="rId12"/>
-      <w:footerReference w:type="default" r:id="rId13"/>
-      <w:headerReference w:type="first" r:id="rId14"/>
-      <w:footerReference w:type="first" r:id="rId15"/>
+      <w:headerReference w:type="default" r:id="rId44"/>
+      <w:footerReference w:type="default" r:id="rId45"/>
+      <w:headerReference w:type="first" r:id="rId46"/>
+      <w:footerReference w:type="first" r:id="rId47"/>
       <w:pgSz w:w="11909" w:h="16834"/>
       <w:pgMar w:top="1440" w:right="1440" w:bottom="1440" w:left="1440" w:header="283" w:footer="0" w:gutter="0"/>
       <w:pgNumType w:start="1"/>
@@ -51771,6 +51321,7 @@
   <w:style w:type="paragraph" w:default="1" w:styleId="Normal">
     <w:name w:val="Normal"/>
     <w:qFormat/>
+    <w:rsid w:val="00D27637"/>
   </w:style>
   <w:style w:type="paragraph" w:styleId="Ttulo1">
     <w:name w:val="heading 1"/>
@@ -51892,6 +51443,7 @@
   <w:style w:type="character" w:default="1" w:styleId="Fuentedeprrafopredeter">
     <w:name w:val="Default Paragraph Font"/>
     <w:uiPriority w:val="1"/>
+    <w:semiHidden/>
     <w:unhideWhenUsed/>
   </w:style>
   <w:style w:type="table" w:default="1" w:styleId="Tablanormal">
@@ -52438,6 +51990,49 @@
       <w:szCs w:val="32"/>
     </w:rPr>
   </w:style>
+  <w:style w:type="character" w:styleId="Mencinsinresolver">
+    <w:name w:val="Unresolved Mention"/>
+    <w:basedOn w:val="Fuentedeprrafopredeter"/>
+    <w:uiPriority w:val="99"/>
+    <w:semiHidden/>
+    <w:unhideWhenUsed/>
+    <w:rsid w:val="003B149C"/>
+    <w:rPr>
+      <w:color w:val="605E5C"/>
+      <w:shd w:val="clear" w:color="auto" w:fill="E1DFDD"/>
+    </w:rPr>
+  </w:style>
+  <w:style w:type="character" w:styleId="Hipervnculovisitado">
+    <w:name w:val="FollowedHyperlink"/>
+    <w:basedOn w:val="Fuentedeprrafopredeter"/>
+    <w:uiPriority w:val="99"/>
+    <w:semiHidden/>
+    <w:unhideWhenUsed/>
+    <w:rsid w:val="00885E46"/>
+    <w:rPr>
+      <w:color w:val="800080" w:themeColor="followedHyperlink"/>
+      <w:u w:val="single"/>
+    </w:rPr>
+  </w:style>
+  <w:style w:type="table" w:styleId="Tablaconcuadrcula">
+    <w:name w:val="Table Grid"/>
+    <w:basedOn w:val="Tablanormal"/>
+    <w:uiPriority w:val="39"/>
+    <w:rsid w:val="002F5103"/>
+    <w:pPr>
+      <w:spacing w:before="0" w:after="0" w:line="240" w:lineRule="auto"/>
+    </w:pPr>
+    <w:tblPr>
+      <w:tblBorders>
+        <w:top w:val="single" w:sz="4" w:space="0" w:color="auto"/>
+        <w:left w:val="single" w:sz="4" w:space="0" w:color="auto"/>
+        <w:bottom w:val="single" w:sz="4" w:space="0" w:color="auto"/>
+        <w:right w:val="single" w:sz="4" w:space="0" w:color="auto"/>
+        <w:insideH w:val="single" w:sz="4" w:space="0" w:color="auto"/>
+        <w:insideV w:val="single" w:sz="4" w:space="0" w:color="auto"/>
+      </w:tblBorders>
+    </w:tblPr>
+  </w:style>
 </w:styles>
 </file>
 
@@ -52789,6 +52384,10 @@
 </go:gDocsCustomXmlDataStorage>
 </file>
 
+<file path=customXml/item2.xml><?xml version="1.0" encoding="utf-8"?>
+<b:Sources xmlns:b="http://schemas.openxmlformats.org/officeDocument/2006/bibliography" xmlns="http://schemas.openxmlformats.org/officeDocument/2006/bibliography" SelectedStyle="\APASixthEditionOfficeOnline.xsl" StyleName="APA" Version="6"/>
+</file>
+
 <file path=customXml/itemProps1.xml><?xml version="1.0" encoding="utf-8"?>
 <ds:datastoreItem xmlns:ds="http://schemas.openxmlformats.org/officeDocument/2006/customXml" ds:itemID="{11111111-1234-1234-1234-123412341234}">
   <ds:schemaRefs>
@@ -52796,4 +52395,12 @@
     <ds:schemaRef ds:uri="http://schemas.openxmlformats.org/officeDocument/2006/relationships"/>
   </ds:schemaRefs>
 </ds:datastoreItem>
+</file>
+
+<file path=customXml/itemProps2.xml><?xml version="1.0" encoding="utf-8"?>
+<ds:datastoreItem xmlns:ds="http://schemas.openxmlformats.org/officeDocument/2006/customXml" ds:itemID="{596C4ED7-7D6B-44F9-ACB2-1263B5FE81C4}">
+  <ds:schemaRefs>
+    <ds:schemaRef ds:uri="http://schemas.openxmlformats.org/officeDocument/2006/bibliography"/>
+  </ds:schemaRefs>
+</ds:datastoreItem>
 </file>
</xml_diff>